<commit_message>
Solucion a errores y modificacion Documentacion
</commit_message>
<xml_diff>
--- a/README.docx
+++ b/README.docx
@@ -100,47 +100,7 @@
           <w:sz w:val="22"/>
           <w:szCs w:val="22"/>
         </w:rPr>
-        <w:t xml:space="preserve">El sistema interactivo web trata de una </w:t>
-      </w:r>
-      <w:proofErr w:type="spellStart"/>
-      <w:r>
-        <w:rPr>
-          <w:rFonts w:ascii="Arial Narrow" w:hAnsi="Arial Narrow"/>
-          <w:bCs/>
-          <w:sz w:val="22"/>
-          <w:szCs w:val="22"/>
-        </w:rPr>
-        <w:t>pagina</w:t>
-      </w:r>
-      <w:proofErr w:type="spellEnd"/>
-      <w:r>
-        <w:rPr>
-          <w:rFonts w:ascii="Arial Narrow" w:hAnsi="Arial Narrow"/>
-          <w:bCs/>
-          <w:sz w:val="22"/>
-          <w:szCs w:val="22"/>
-        </w:rPr>
-        <w:t xml:space="preserve"> de películas con registro </w:t>
-      </w:r>
-      <w:proofErr w:type="spellStart"/>
-      <w:r>
-        <w:rPr>
-          <w:rFonts w:ascii="Arial Narrow" w:hAnsi="Arial Narrow"/>
-          <w:bCs/>
-          <w:sz w:val="22"/>
-          <w:szCs w:val="22"/>
-        </w:rPr>
-        <w:t>y</w:t>
-      </w:r>
-      <w:proofErr w:type="spellEnd"/>
-      <w:r>
-        <w:rPr>
-          <w:rFonts w:ascii="Arial Narrow" w:hAnsi="Arial Narrow"/>
-          <w:bCs/>
-          <w:sz w:val="22"/>
-          <w:szCs w:val="22"/>
-        </w:rPr>
-        <w:t xml:space="preserve"> inicio de sesión</w:t>
+        <w:t>Aplicación web interactiva sobre peliculas online con sistema de autenticación de usuarios (registro y login)</w:t>
       </w:r>
     </w:p>
     <w:p>
@@ -179,25 +139,7 @@
           <w:bCs/>
           <w:lang w:val="es-CL"/>
         </w:rPr>
-        <w:t xml:space="preserve">Una página principal (index.html) basada en una maqueta simple (puede ser propia o inspirada en un </w:t>
-      </w:r>
-      <w:proofErr w:type="spellStart"/>
-      <w:r>
-        <w:rPr>
-          <w:rFonts w:ascii="Arial Narrow" w:hAnsi="Arial Narrow"/>
-          <w:bCs/>
-          <w:lang w:val="es-CL"/>
-        </w:rPr>
-        <w:t>layout</w:t>
-      </w:r>
-      <w:proofErr w:type="spellEnd"/>
-      <w:r>
-        <w:rPr>
-          <w:rFonts w:ascii="Arial Narrow" w:hAnsi="Arial Narrow"/>
-          <w:bCs/>
-          <w:lang w:val="es-CL"/>
-        </w:rPr>
-        <w:t>).</w:t>
+        <w:t>Una página principal (index.html) basada en una maqueta simple (puede ser propia o inspirada en un layout).</w:t>
       </w:r>
     </w:p>
     <w:p>
@@ -289,41 +231,66 @@
     </w:p>
     <w:p>
       <w:pPr>
-        <w:spacing w:after="120"/>
-        <w:jc w:val="both"/>
-        <w:rPr>
-          <w:rFonts w:ascii="Arial Narrow" w:hAnsi="Arial Narrow"/>
-          <w:bCs/>
-          <w:sz w:val="22"/>
-          <w:szCs w:val="22"/>
-        </w:rPr>
-      </w:pPr>
-      <w:r>
-        <w:rPr>
-          <w:rFonts w:ascii="Arial Narrow" w:hAnsi="Arial Narrow"/>
-          <w:bCs/>
-          <w:sz w:val="22"/>
-          <w:szCs w:val="22"/>
+        <w:pStyle w:val="Listaconvietas"/>
+        <w:numPr>
+          <w:ilvl w:val="0"/>
+          <w:numId w:val="5"/>
+        </w:numPr>
+        <w:rPr>
+          <w:rFonts w:ascii="Arial Narrow" w:hAnsi="Arial Narrow"/>
+          <w:b/>
+          <w:bCs/>
+          <w:lang w:val="es-CL"/>
+        </w:rPr>
+      </w:pPr>
+      <w:r>
+        <w:rPr>
+          <w:rFonts w:ascii="Arial Narrow" w:hAnsi="Arial Narrow"/>
+          <w:lang w:val="es-CL"/>
+        </w:rPr>
+        <w:t>Manipulación del DOM: seleccionar y modificar elementos (texto, atributos y/o clas</w:t>
+      </w:r>
+      <w:r>
+        <w:rPr>
+          <w:rFonts w:ascii="Arial Narrow" w:hAnsi="Arial Narrow"/>
+          <w:b/>
+          <w:bCs/>
+          <w:lang w:val="es-CL"/>
+        </w:rPr>
+        <w:t>es).</w:t>
+      </w:r>
+    </w:p>
+    <w:p>
+      <w:pPr>
+        <w:pStyle w:val="Listaconvietas"/>
+        <w:numPr>
+          <w:ilvl w:val="0"/>
+          <w:numId w:val="0"/>
+        </w:numPr>
+        <w:ind w:left="720"/>
+        <w:rPr>
+          <w:rFonts w:ascii="Arial Narrow" w:hAnsi="Arial Narrow"/>
+          <w:bCs/>
+        </w:rPr>
+      </w:pPr>
+      <w:r>
+        <w:rPr>
+          <w:rFonts w:ascii="Arial Narrow" w:hAnsi="Arial Narrow"/>
+          <w:bCs/>
         </w:rPr>
         <w:t xml:space="preserve">Para cumplir el requerimiento, he </w:t>
       </w:r>
-      <w:proofErr w:type="spellStart"/>
-      <w:r>
-        <w:rPr>
-          <w:rFonts w:ascii="Arial Narrow" w:hAnsi="Arial Narrow"/>
-          <w:bCs/>
-          <w:sz w:val="22"/>
-          <w:szCs w:val="22"/>
+      <w:r>
+        <w:rPr>
+          <w:rFonts w:ascii="Arial Narrow" w:hAnsi="Arial Narrow"/>
+          <w:bCs/>
         </w:rPr>
         <w:t>utilizando</w:t>
       </w:r>
-      <w:proofErr w:type="spellEnd"/>
-      <w:r>
-        <w:rPr>
-          <w:rFonts w:ascii="Arial Narrow" w:hAnsi="Arial Narrow"/>
-          <w:bCs/>
-          <w:sz w:val="22"/>
-          <w:szCs w:val="22"/>
+      <w:r>
+        <w:rPr>
+          <w:rFonts w:ascii="Arial Narrow" w:hAnsi="Arial Narrow"/>
+          <w:bCs/>
         </w:rPr>
         <w:t xml:space="preserve"> </w:t>
       </w:r>
@@ -331,28 +298,20 @@
         <w:rPr>
           <w:rFonts w:ascii="Arial Narrow" w:hAnsi="Arial Narrow"/>
           <w:bCs/>
-          <w:sz w:val="22"/>
-          <w:szCs w:val="22"/>
         </w:rPr>
         <w:t>&lt;</w:t>
       </w:r>
-      <w:proofErr w:type="spellStart"/>
-      <w:r>
-        <w:rPr>
-          <w:rFonts w:ascii="Arial Narrow" w:hAnsi="Arial Narrow"/>
-          <w:bCs/>
-          <w:sz w:val="22"/>
-          <w:szCs w:val="22"/>
+      <w:r>
+        <w:rPr>
+          <w:rFonts w:ascii="Arial Narrow" w:hAnsi="Arial Narrow"/>
+          <w:bCs/>
         </w:rPr>
         <w:t>span</w:t>
       </w:r>
-      <w:proofErr w:type="spellEnd"/>
-      <w:r>
-        <w:rPr>
-          <w:rFonts w:ascii="Arial Narrow" w:hAnsi="Arial Narrow"/>
-          <w:bCs/>
-          <w:sz w:val="22"/>
-          <w:szCs w:val="22"/>
+      <w:r>
+        <w:rPr>
+          <w:rFonts w:ascii="Arial Narrow" w:hAnsi="Arial Narrow"/>
+          <w:bCs/>
         </w:rPr>
         <w:t>&gt;</w:t>
       </w:r>
@@ -360,8 +319,6 @@
         <w:rPr>
           <w:rFonts w:ascii="Arial Narrow" w:hAnsi="Arial Narrow"/>
           <w:bCs/>
-          <w:sz w:val="22"/>
-          <w:szCs w:val="22"/>
         </w:rPr>
         <w:t xml:space="preserve"> debajo de cada </w:t>
       </w:r>
@@ -369,8 +326,6 @@
         <w:rPr>
           <w:rFonts w:ascii="Arial Narrow" w:hAnsi="Arial Narrow"/>
           <w:bCs/>
-          <w:sz w:val="22"/>
-          <w:szCs w:val="22"/>
         </w:rPr>
         <w:t>campo</w:t>
       </w:r>
@@ -378,8 +333,6 @@
         <w:rPr>
           <w:rFonts w:ascii="Arial Narrow" w:hAnsi="Arial Narrow"/>
           <w:bCs/>
-          <w:sz w:val="22"/>
-          <w:szCs w:val="22"/>
         </w:rPr>
         <w:t xml:space="preserve"> para avisar al usuario que no </w:t>
       </w:r>
@@ -387,8 +340,6 @@
         <w:rPr>
           <w:rFonts w:ascii="Arial Narrow" w:hAnsi="Arial Narrow"/>
           <w:bCs/>
-          <w:sz w:val="22"/>
-          <w:szCs w:val="22"/>
         </w:rPr>
         <w:t>está</w:t>
       </w:r>
@@ -396,32 +347,17 @@
         <w:rPr>
           <w:rFonts w:ascii="Arial Narrow" w:hAnsi="Arial Narrow"/>
           <w:bCs/>
-          <w:sz w:val="22"/>
-          <w:szCs w:val="22"/>
         </w:rPr>
         <w:t xml:space="preserve"> disponible o que no cumple lo solicitado por el campo. Respecto a cada campo muestra</w:t>
       </w:r>
-    </w:p>
-    <w:p>
-      <w:pPr>
-        <w:spacing w:after="120"/>
-        <w:jc w:val="both"/>
-        <w:rPr>
-          <w:rFonts w:ascii="Arial Narrow" w:hAnsi="Arial Narrow"/>
-          <w:bCs/>
-          <w:sz w:val="22"/>
-          <w:szCs w:val="22"/>
-        </w:rPr>
-      </w:pPr>
-      <w:r>
-        <w:rPr>
-          <w:rFonts w:ascii="Arial Narrow" w:hAnsi="Arial Narrow"/>
-          <w:bCs/>
-          <w:sz w:val="22"/>
-          <w:szCs w:val="22"/>
+      <w:r>
+        <w:rPr>
+          <w:rFonts w:ascii="Arial Narrow" w:hAnsi="Arial Narrow"/>
+          <w:bCs/>
+          <w:noProof/>
         </w:rPr>
         <w:drawing>
-          <wp:inline distT="0" distB="0" distL="0" distR="0" wp14:anchorId="196332A9" wp14:editId="0D9B45EE">
+          <wp:inline distT="0" distB="0" distL="0" distR="0" wp14:anchorId="35441A58" wp14:editId="10B363D5">
             <wp:extent cx="4305673" cy="358171"/>
             <wp:effectExtent l="0" t="0" r="0" b="3810"/>
             <wp:docPr id="639895127" name="Imagen 1"/>
@@ -456,27 +392,14 @@
           </wp:inline>
         </w:drawing>
       </w:r>
-    </w:p>
-    <w:p>
-      <w:pPr>
-        <w:spacing w:after="120"/>
-        <w:jc w:val="both"/>
-        <w:rPr>
-          <w:rFonts w:ascii="Arial Narrow" w:hAnsi="Arial Narrow"/>
-          <w:bCs/>
-          <w:sz w:val="22"/>
-          <w:szCs w:val="22"/>
-        </w:rPr>
-      </w:pPr>
-      <w:r>
-        <w:rPr>
-          <w:rFonts w:ascii="Arial Narrow" w:hAnsi="Arial Narrow"/>
-          <w:bCs/>
-          <w:sz w:val="22"/>
-          <w:szCs w:val="22"/>
+      <w:r>
+        <w:rPr>
+          <w:rFonts w:ascii="Arial Narrow" w:hAnsi="Arial Narrow"/>
+          <w:bCs/>
+          <w:noProof/>
         </w:rPr>
         <w:drawing>
-          <wp:inline distT="0" distB="0" distL="0" distR="0" wp14:anchorId="57CDAFA8" wp14:editId="08D89DEC">
+          <wp:inline distT="0" distB="0" distL="0" distR="0" wp14:anchorId="211BEF33" wp14:editId="47B4484D">
             <wp:extent cx="5044877" cy="2575783"/>
             <wp:effectExtent l="0" t="0" r="3810" b="0"/>
             <wp:docPr id="121550142" name="Imagen 1"/>
@@ -524,138 +447,232 @@
       <w:r>
         <w:rPr>
           <w:rFonts w:ascii="Arial Narrow" w:hAnsi="Arial Narrow"/>
-          <w:lang w:val="es-CL"/>
-        </w:rPr>
-        <w:t>Manipulación</w:t>
-      </w:r>
-      <w:r>
-        <w:rPr>
-          <w:rFonts w:ascii="Arial Narrow" w:hAnsi="Arial Narrow"/>
-          <w:bCs/>
-          <w:lang w:val="es-CL"/>
-        </w:rPr>
-        <w:t xml:space="preserve"> del DOM: seleccionar y modificar elementos (texto, atributos y/o clases).</w:t>
+          <w:bCs/>
+          <w:lang w:val="es-CL"/>
+        </w:rPr>
+        <w:t xml:space="preserve">Eventos: </w:t>
+      </w:r>
+      <w:r>
+        <w:rPr>
+          <w:rFonts w:ascii="Arial Narrow" w:hAnsi="Arial Narrow"/>
+          <w:lang w:val="es-CL"/>
+        </w:rPr>
+        <w:t>implementar</w:t>
+      </w:r>
+      <w:r>
+        <w:rPr>
+          <w:rFonts w:ascii="Arial Narrow" w:hAnsi="Arial Narrow"/>
+          <w:bCs/>
+          <w:lang w:val="es-CL"/>
+        </w:rPr>
+        <w:t xml:space="preserve"> al menos 3 eventos distintos (ej.: click, input, submit, change, keyup).</w:t>
+      </w:r>
+      <w:r>
+        <w:rPr>
+          <w:rFonts w:ascii="Arial Narrow" w:hAnsi="Arial Narrow"/>
+          <w:bCs/>
+          <w:lang w:val="es-CL"/>
+        </w:rPr>
+        <w:br/>
+      </w:r>
+      <w:r>
+        <w:rPr>
+          <w:rFonts w:ascii="Arial Narrow" w:hAnsi="Arial Narrow"/>
+          <w:bCs/>
+          <w:lang w:val="es-CL"/>
+        </w:rPr>
+        <w:drawing>
+          <wp:inline distT="0" distB="0" distL="0" distR="0" wp14:anchorId="100ED86F" wp14:editId="6D178487">
+            <wp:extent cx="5612130" cy="346710"/>
+            <wp:effectExtent l="0" t="0" r="7620" b="0"/>
+            <wp:docPr id="1441394695" name="Imagen 1"/>
+            <wp:cNvGraphicFramePr>
+              <a:graphicFrameLocks xmlns:a="http://schemas.openxmlformats.org/drawingml/2006/main" noChangeAspect="1"/>
+            </wp:cNvGraphicFramePr>
+            <a:graphic xmlns:a="http://schemas.openxmlformats.org/drawingml/2006/main">
+              <a:graphicData uri="http://schemas.openxmlformats.org/drawingml/2006/picture">
+                <pic:pic xmlns:pic="http://schemas.openxmlformats.org/drawingml/2006/picture">
+                  <pic:nvPicPr>
+                    <pic:cNvPr id="1441394695" name=""/>
+                    <pic:cNvPicPr/>
+                  </pic:nvPicPr>
+                  <pic:blipFill>
+                    <a:blip r:embed="rId13"/>
+                    <a:stretch>
+                      <a:fillRect/>
+                    </a:stretch>
+                  </pic:blipFill>
+                  <pic:spPr>
+                    <a:xfrm>
+                      <a:off x="0" y="0"/>
+                      <a:ext cx="5612130" cy="346710"/>
+                    </a:xfrm>
+                    <a:prstGeom prst="rect">
+                      <a:avLst/>
+                    </a:prstGeom>
+                  </pic:spPr>
+                </pic:pic>
+              </a:graphicData>
+            </a:graphic>
+          </wp:inline>
+        </w:drawing>
+      </w:r>
+      <w:r>
+        <w:rPr>
+          <w:rFonts w:ascii="Arial Narrow" w:hAnsi="Arial Narrow"/>
+          <w:bCs/>
+          <w:lang w:val="es-CL"/>
+        </w:rPr>
+        <w:br/>
+      </w:r>
+      <w:r>
+        <w:rPr>
+          <w:rFonts w:ascii="Arial Narrow" w:hAnsi="Arial Narrow"/>
+          <w:bCs/>
+          <w:lang w:val="es-CL"/>
+        </w:rPr>
+        <w:drawing>
+          <wp:inline distT="0" distB="0" distL="0" distR="0" wp14:anchorId="415C0699" wp14:editId="0275E491">
+            <wp:extent cx="3467400" cy="167655"/>
+            <wp:effectExtent l="0" t="0" r="0" b="3810"/>
+            <wp:docPr id="38449437" name="Imagen 1"/>
+            <wp:cNvGraphicFramePr>
+              <a:graphicFrameLocks xmlns:a="http://schemas.openxmlformats.org/drawingml/2006/main" noChangeAspect="1"/>
+            </wp:cNvGraphicFramePr>
+            <a:graphic xmlns:a="http://schemas.openxmlformats.org/drawingml/2006/main">
+              <a:graphicData uri="http://schemas.openxmlformats.org/drawingml/2006/picture">
+                <pic:pic xmlns:pic="http://schemas.openxmlformats.org/drawingml/2006/picture">
+                  <pic:nvPicPr>
+                    <pic:cNvPr id="38449437" name=""/>
+                    <pic:cNvPicPr/>
+                  </pic:nvPicPr>
+                  <pic:blipFill>
+                    <a:blip r:embed="rId14"/>
+                    <a:stretch>
+                      <a:fillRect/>
+                    </a:stretch>
+                  </pic:blipFill>
+                  <pic:spPr>
+                    <a:xfrm>
+                      <a:off x="0" y="0"/>
+                      <a:ext cx="3467400" cy="167655"/>
+                    </a:xfrm>
+                    <a:prstGeom prst="rect">
+                      <a:avLst/>
+                    </a:prstGeom>
+                  </pic:spPr>
+                </pic:pic>
+              </a:graphicData>
+            </a:graphic>
+          </wp:inline>
+        </w:drawing>
       </w:r>
     </w:p>
     <w:p>
       <w:pPr>
         <w:pStyle w:val="Listaconvietas"/>
-        <w:rPr>
-          <w:rFonts w:ascii="Arial Narrow" w:hAnsi="Arial Narrow"/>
-          <w:bCs/>
-          <w:lang w:val="es-CL"/>
-        </w:rPr>
-      </w:pPr>
-      <w:r>
-        <w:rPr>
-          <w:rFonts w:ascii="Arial Narrow" w:hAnsi="Arial Narrow"/>
-          <w:bCs/>
-          <w:lang w:val="es-CL"/>
-        </w:rPr>
-        <w:t xml:space="preserve">Eventos: </w:t>
-      </w:r>
-      <w:r>
-        <w:rPr>
-          <w:rFonts w:ascii="Arial Narrow" w:hAnsi="Arial Narrow"/>
-          <w:lang w:val="es-CL"/>
-        </w:rPr>
-        <w:t>implementar</w:t>
-      </w:r>
-      <w:r>
-        <w:rPr>
-          <w:rFonts w:ascii="Arial Narrow" w:hAnsi="Arial Narrow"/>
-          <w:bCs/>
-          <w:lang w:val="es-CL"/>
-        </w:rPr>
-        <w:t xml:space="preserve"> al menos 3 eventos distintos (ej.: </w:t>
-      </w:r>
-      <w:proofErr w:type="spellStart"/>
-      <w:r>
-        <w:rPr>
-          <w:rFonts w:ascii="Arial Narrow" w:hAnsi="Arial Narrow"/>
-          <w:bCs/>
-          <w:lang w:val="es-CL"/>
-        </w:rPr>
-        <w:t>click</w:t>
-      </w:r>
-      <w:proofErr w:type="spellEnd"/>
-      <w:r>
-        <w:rPr>
-          <w:rFonts w:ascii="Arial Narrow" w:hAnsi="Arial Narrow"/>
-          <w:bCs/>
-          <w:lang w:val="es-CL"/>
-        </w:rPr>
-        <w:t xml:space="preserve">, input, </w:t>
-      </w:r>
-      <w:proofErr w:type="spellStart"/>
-      <w:r>
-        <w:rPr>
-          <w:rFonts w:ascii="Arial Narrow" w:hAnsi="Arial Narrow"/>
-          <w:bCs/>
-          <w:lang w:val="es-CL"/>
-        </w:rPr>
-        <w:t>submit</w:t>
-      </w:r>
-      <w:proofErr w:type="spellEnd"/>
-      <w:r>
-        <w:rPr>
-          <w:rFonts w:ascii="Arial Narrow" w:hAnsi="Arial Narrow"/>
-          <w:bCs/>
-          <w:lang w:val="es-CL"/>
-        </w:rPr>
-        <w:t xml:space="preserve">, </w:t>
-      </w:r>
-      <w:proofErr w:type="spellStart"/>
-      <w:r>
-        <w:rPr>
-          <w:rFonts w:ascii="Arial Narrow" w:hAnsi="Arial Narrow"/>
-          <w:bCs/>
-          <w:lang w:val="es-CL"/>
-        </w:rPr>
-        <w:t>change</w:t>
-      </w:r>
-      <w:proofErr w:type="spellEnd"/>
-      <w:r>
-        <w:rPr>
-          <w:rFonts w:ascii="Arial Narrow" w:hAnsi="Arial Narrow"/>
-          <w:bCs/>
-          <w:lang w:val="es-CL"/>
-        </w:rPr>
-        <w:t xml:space="preserve">, </w:t>
-      </w:r>
-      <w:proofErr w:type="spellStart"/>
-      <w:r>
-        <w:rPr>
-          <w:rFonts w:ascii="Arial Narrow" w:hAnsi="Arial Narrow"/>
-          <w:bCs/>
-          <w:lang w:val="es-CL"/>
-        </w:rPr>
-        <w:t>keyup</w:t>
-      </w:r>
-      <w:proofErr w:type="spellEnd"/>
-      <w:r>
-        <w:rPr>
-          <w:rFonts w:ascii="Arial Narrow" w:hAnsi="Arial Narrow"/>
-          <w:bCs/>
-          <w:lang w:val="es-CL"/>
-        </w:rPr>
-        <w:t>).</w:t>
-      </w:r>
+        <w:numPr>
+          <w:ilvl w:val="0"/>
+          <w:numId w:val="0"/>
+        </w:numPr>
+        <w:ind w:left="360"/>
+        <w:rPr>
+          <w:rFonts w:ascii="Arial Narrow" w:hAnsi="Arial Narrow"/>
+          <w:bCs/>
+          <w:lang w:val="es-CL"/>
+        </w:rPr>
+      </w:pPr>
     </w:p>
     <w:p>
       <w:pPr>
         <w:pStyle w:val="Listaconvietas"/>
-        <w:rPr>
-          <w:rFonts w:ascii="Arial Narrow" w:hAnsi="Arial Narrow"/>
-          <w:bCs/>
-          <w:lang w:val="es-CL"/>
-        </w:rPr>
-      </w:pPr>
-      <w:r>
-        <w:rPr>
-          <w:rFonts w:ascii="Arial Narrow" w:hAnsi="Arial Narrow"/>
-          <w:lang w:val="es-CL"/>
-        </w:rPr>
+        <w:numPr>
+          <w:ilvl w:val="0"/>
+          <w:numId w:val="0"/>
+        </w:numPr>
+        <w:ind w:left="360"/>
+        <w:rPr>
+          <w:rFonts w:ascii="Arial Narrow" w:hAnsi="Arial Narrow"/>
+          <w:bCs/>
+          <w:lang w:val="es-CL"/>
+        </w:rPr>
+      </w:pPr>
+    </w:p>
+    <w:p>
+      <w:pPr>
+        <w:pStyle w:val="Listaconvietas"/>
+        <w:numPr>
+          <w:ilvl w:val="0"/>
+          <w:numId w:val="0"/>
+        </w:numPr>
+        <w:ind w:left="360"/>
+        <w:rPr>
+          <w:rFonts w:ascii="Arial Narrow" w:hAnsi="Arial Narrow"/>
+          <w:bCs/>
+          <w:lang w:val="es-CL"/>
+        </w:rPr>
+      </w:pPr>
+    </w:p>
+    <w:p>
+      <w:pPr>
+        <w:pStyle w:val="Listaconvietas"/>
+        <w:numPr>
+          <w:ilvl w:val="0"/>
+          <w:numId w:val="0"/>
+        </w:numPr>
+        <w:ind w:left="360"/>
+        <w:rPr>
+          <w:rFonts w:ascii="Arial Narrow" w:hAnsi="Arial Narrow"/>
+          <w:bCs/>
+          <w:lang w:val="es-CL"/>
+        </w:rPr>
+      </w:pPr>
+    </w:p>
+    <w:p>
+      <w:pPr>
+        <w:pStyle w:val="Listaconvietas"/>
+        <w:numPr>
+          <w:ilvl w:val="0"/>
+          <w:numId w:val="0"/>
+        </w:numPr>
+        <w:ind w:left="360"/>
+        <w:rPr>
+          <w:rFonts w:ascii="Arial Narrow" w:hAnsi="Arial Narrow"/>
+          <w:bCs/>
+          <w:lang w:val="es-CL"/>
+        </w:rPr>
+      </w:pPr>
+    </w:p>
+    <w:p>
+      <w:pPr>
+        <w:pStyle w:val="Listaconvietas"/>
+        <w:numPr>
+          <w:ilvl w:val="0"/>
+          <w:numId w:val="0"/>
+        </w:numPr>
+        <w:ind w:left="360"/>
+        <w:rPr>
+          <w:rFonts w:ascii="Arial Narrow" w:hAnsi="Arial Narrow"/>
+          <w:bCs/>
+          <w:lang w:val="es-CL"/>
+        </w:rPr>
+      </w:pPr>
+    </w:p>
+    <w:p>
+      <w:pPr>
+        <w:pStyle w:val="Listaconvietas"/>
+        <w:rPr>
+          <w:rFonts w:ascii="Arial Narrow" w:hAnsi="Arial Narrow"/>
+          <w:bCs/>
+          <w:lang w:val="es-CL"/>
+        </w:rPr>
+      </w:pPr>
+      <w:r>
+        <w:rPr>
+          <w:rFonts w:ascii="Arial Narrow" w:hAnsi="Arial Narrow"/>
+          <w:lang w:val="es-CL"/>
+        </w:rPr>
+        <w:lastRenderedPageBreak/>
         <w:t>Generación</w:t>
       </w:r>
       <w:r>
@@ -664,61 +681,64 @@
           <w:bCs/>
           <w:lang w:val="es-CL"/>
         </w:rPr>
-        <w:t xml:space="preserve"> dinámica: crear/insertar/eliminar elementos desde JS (</w:t>
-      </w:r>
-      <w:proofErr w:type="spellStart"/>
-      <w:r>
-        <w:rPr>
-          <w:rFonts w:ascii="Arial Narrow" w:hAnsi="Arial Narrow"/>
-          <w:bCs/>
-          <w:lang w:val="es-CL"/>
-        </w:rPr>
-        <w:t>createElement</w:t>
-      </w:r>
-      <w:proofErr w:type="spellEnd"/>
-      <w:r>
-        <w:rPr>
-          <w:rFonts w:ascii="Arial Narrow" w:hAnsi="Arial Narrow"/>
-          <w:bCs/>
-          <w:lang w:val="es-CL"/>
-        </w:rPr>
-        <w:t>/</w:t>
-      </w:r>
-      <w:proofErr w:type="spellStart"/>
-      <w:r>
-        <w:rPr>
-          <w:rFonts w:ascii="Arial Narrow" w:hAnsi="Arial Narrow"/>
-          <w:bCs/>
-          <w:lang w:val="es-CL"/>
-        </w:rPr>
-        <w:t>append</w:t>
-      </w:r>
-      <w:proofErr w:type="spellEnd"/>
-      <w:r>
-        <w:rPr>
-          <w:rFonts w:ascii="Arial Narrow" w:hAnsi="Arial Narrow"/>
-          <w:bCs/>
-          <w:lang w:val="es-CL"/>
-        </w:rPr>
-        <w:t>/</w:t>
-      </w:r>
-      <w:proofErr w:type="spellStart"/>
-      <w:r>
-        <w:rPr>
-          <w:rFonts w:ascii="Arial Narrow" w:hAnsi="Arial Narrow"/>
-          <w:bCs/>
-          <w:lang w:val="es-CL"/>
-        </w:rPr>
-        <w:t>remove</w:t>
-      </w:r>
-      <w:proofErr w:type="spellEnd"/>
-      <w:r>
-        <w:rPr>
-          <w:rFonts w:ascii="Arial Narrow" w:hAnsi="Arial Narrow"/>
-          <w:bCs/>
-          <w:lang w:val="es-CL"/>
-        </w:rPr>
-        <w:t>).</w:t>
+        <w:t xml:space="preserve"> dinámica: crear/insertar/eliminar elementos desde JS (createElement/append/remove).</w:t>
+      </w:r>
+    </w:p>
+    <w:p>
+      <w:pPr>
+        <w:pStyle w:val="Listaconvietas"/>
+        <w:numPr>
+          <w:ilvl w:val="0"/>
+          <w:numId w:val="0"/>
+        </w:numPr>
+        <w:ind w:left="360"/>
+        <w:rPr>
+          <w:rFonts w:ascii="Arial Narrow" w:hAnsi="Arial Narrow"/>
+          <w:bCs/>
+          <w:lang w:val="es-CL"/>
+        </w:rPr>
+      </w:pPr>
+      <w:r>
+        <w:rPr>
+          <w:rFonts w:ascii="Arial Narrow" w:hAnsi="Arial Narrow"/>
+          <w:bCs/>
+          <w:lang w:val="es-CL"/>
+        </w:rPr>
+        <w:drawing>
+          <wp:inline distT="0" distB="0" distL="0" distR="0" wp14:anchorId="39E6CD43" wp14:editId="665D5D2D">
+            <wp:extent cx="3703641" cy="1646063"/>
+            <wp:effectExtent l="0" t="0" r="0" b="0"/>
+            <wp:docPr id="266814102" name="Imagen 1"/>
+            <wp:cNvGraphicFramePr>
+              <a:graphicFrameLocks xmlns:a="http://schemas.openxmlformats.org/drawingml/2006/main" noChangeAspect="1"/>
+            </wp:cNvGraphicFramePr>
+            <a:graphic xmlns:a="http://schemas.openxmlformats.org/drawingml/2006/main">
+              <a:graphicData uri="http://schemas.openxmlformats.org/drawingml/2006/picture">
+                <pic:pic xmlns:pic="http://schemas.openxmlformats.org/drawingml/2006/picture">
+                  <pic:nvPicPr>
+                    <pic:cNvPr id="266814102" name=""/>
+                    <pic:cNvPicPr/>
+                  </pic:nvPicPr>
+                  <pic:blipFill>
+                    <a:blip r:embed="rId15"/>
+                    <a:stretch>
+                      <a:fillRect/>
+                    </a:stretch>
+                  </pic:blipFill>
+                  <pic:spPr>
+                    <a:xfrm>
+                      <a:off x="0" y="0"/>
+                      <a:ext cx="3703641" cy="1646063"/>
+                    </a:xfrm>
+                    <a:prstGeom prst="rect">
+                      <a:avLst/>
+                    </a:prstGeom>
+                  </pic:spPr>
+                </pic:pic>
+              </a:graphicData>
+            </a:graphic>
+          </wp:inline>
+        </w:drawing>
       </w:r>
     </w:p>
     <w:p>
@@ -763,73 +783,371 @@
     <w:p>
       <w:pPr>
         <w:pStyle w:val="Listaconvietas"/>
-        <w:rPr>
-          <w:rFonts w:ascii="Arial Narrow" w:hAnsi="Arial Narrow"/>
-          <w:bCs/>
-          <w:lang w:val="es-CL"/>
-        </w:rPr>
-      </w:pPr>
-      <w:r>
-        <w:rPr>
-          <w:rFonts w:ascii="Arial Narrow" w:hAnsi="Arial Narrow"/>
-          <w:bCs/>
-          <w:lang w:val="es-CL"/>
-        </w:rPr>
-        <w:t xml:space="preserve">Mensajes de error por campo y </w:t>
-      </w:r>
-      <w:proofErr w:type="spellStart"/>
-      <w:r>
-        <w:rPr>
-          <w:rFonts w:ascii="Arial Narrow" w:hAnsi="Arial Narrow"/>
-          <w:bCs/>
-          <w:lang w:val="es-CL"/>
-        </w:rPr>
-        <w:t>feedback</w:t>
-      </w:r>
-      <w:proofErr w:type="spellEnd"/>
-      <w:r>
-        <w:rPr>
-          <w:rFonts w:ascii="Arial Narrow" w:hAnsi="Arial Narrow"/>
-          <w:bCs/>
-          <w:lang w:val="es-CL"/>
-        </w:rPr>
-        <w:t xml:space="preserve"> visual (clases CSS).</w:t>
+        <w:numPr>
+          <w:ilvl w:val="0"/>
+          <w:numId w:val="0"/>
+        </w:numPr>
+        <w:ind w:left="360"/>
+        <w:rPr>
+          <w:rFonts w:ascii="Arial Narrow" w:hAnsi="Arial Narrow"/>
+          <w:bCs/>
+          <w:lang w:val="es-CL"/>
+        </w:rPr>
+      </w:pPr>
+      <w:r>
+        <w:rPr>
+          <w:rFonts w:ascii="Arial Narrow" w:hAnsi="Arial Narrow"/>
+          <w:bCs/>
+          <w:lang w:val="es-CL"/>
+        </w:rPr>
+        <w:drawing>
+          <wp:inline distT="0" distB="0" distL="0" distR="0" wp14:anchorId="010FBF48" wp14:editId="5429E115">
+            <wp:extent cx="4435224" cy="533446"/>
+            <wp:effectExtent l="0" t="0" r="3810" b="0"/>
+            <wp:docPr id="2088376594" name="Imagen 1"/>
+            <wp:cNvGraphicFramePr>
+              <a:graphicFrameLocks xmlns:a="http://schemas.openxmlformats.org/drawingml/2006/main" noChangeAspect="1"/>
+            </wp:cNvGraphicFramePr>
+            <a:graphic xmlns:a="http://schemas.openxmlformats.org/drawingml/2006/main">
+              <a:graphicData uri="http://schemas.openxmlformats.org/drawingml/2006/picture">
+                <pic:pic xmlns:pic="http://schemas.openxmlformats.org/drawingml/2006/picture">
+                  <pic:nvPicPr>
+                    <pic:cNvPr id="2088376594" name=""/>
+                    <pic:cNvPicPr/>
+                  </pic:nvPicPr>
+                  <pic:blipFill>
+                    <a:blip r:embed="rId16"/>
+                    <a:stretch>
+                      <a:fillRect/>
+                    </a:stretch>
+                  </pic:blipFill>
+                  <pic:spPr>
+                    <a:xfrm>
+                      <a:off x="0" y="0"/>
+                      <a:ext cx="4435224" cy="533446"/>
+                    </a:xfrm>
+                    <a:prstGeom prst="rect">
+                      <a:avLst/>
+                    </a:prstGeom>
+                  </pic:spPr>
+                </pic:pic>
+              </a:graphicData>
+            </a:graphic>
+          </wp:inline>
+        </w:drawing>
       </w:r>
     </w:p>
     <w:p>
       <w:pPr>
         <w:pStyle w:val="Listaconvietas"/>
-        <w:rPr>
-          <w:rFonts w:ascii="Arial Narrow" w:hAnsi="Arial Narrow"/>
-          <w:bCs/>
-          <w:lang w:val="es-CL"/>
-        </w:rPr>
-      </w:pPr>
-      <w:r>
-        <w:rPr>
-          <w:rFonts w:ascii="Arial Narrow" w:hAnsi="Arial Narrow"/>
-          <w:bCs/>
-          <w:lang w:val="es-CL"/>
-        </w:rPr>
-        <w:t>Prevención de envío cuando existan errores (</w:t>
-      </w:r>
-      <w:proofErr w:type="spellStart"/>
-      <w:r>
-        <w:rPr>
-          <w:rFonts w:ascii="Arial Narrow" w:hAnsi="Arial Narrow"/>
-          <w:bCs/>
-          <w:lang w:val="es-CL"/>
-        </w:rPr>
-        <w:t>preventDefault</w:t>
-      </w:r>
-      <w:proofErr w:type="spellEnd"/>
-      <w:r>
-        <w:rPr>
-          <w:rFonts w:ascii="Arial Narrow" w:hAnsi="Arial Narrow"/>
-          <w:bCs/>
-          <w:lang w:val="es-CL"/>
-        </w:rPr>
-        <w:t>).</w:t>
+        <w:numPr>
+          <w:ilvl w:val="0"/>
+          <w:numId w:val="0"/>
+        </w:numPr>
+        <w:ind w:left="360"/>
+        <w:rPr>
+          <w:rFonts w:ascii="Arial Narrow" w:hAnsi="Arial Narrow"/>
+          <w:bCs/>
+          <w:lang w:val="es-CL"/>
+        </w:rPr>
+      </w:pPr>
+      <w:r>
+        <w:rPr>
+          <w:rFonts w:ascii="Arial Narrow" w:hAnsi="Arial Narrow"/>
+          <w:bCs/>
+          <w:lang w:val="es-CL"/>
+        </w:rPr>
+        <w:drawing>
+          <wp:inline distT="0" distB="0" distL="0" distR="0" wp14:anchorId="12A2FD70" wp14:editId="11E15DF9">
+            <wp:extent cx="4305673" cy="723963"/>
+            <wp:effectExtent l="0" t="0" r="0" b="0"/>
+            <wp:docPr id="57628364" name="Imagen 1"/>
+            <wp:cNvGraphicFramePr>
+              <a:graphicFrameLocks xmlns:a="http://schemas.openxmlformats.org/drawingml/2006/main" noChangeAspect="1"/>
+            </wp:cNvGraphicFramePr>
+            <a:graphic xmlns:a="http://schemas.openxmlformats.org/drawingml/2006/main">
+              <a:graphicData uri="http://schemas.openxmlformats.org/drawingml/2006/picture">
+                <pic:pic xmlns:pic="http://schemas.openxmlformats.org/drawingml/2006/picture">
+                  <pic:nvPicPr>
+                    <pic:cNvPr id="57628364" name=""/>
+                    <pic:cNvPicPr/>
+                  </pic:nvPicPr>
+                  <pic:blipFill>
+                    <a:blip r:embed="rId17"/>
+                    <a:stretch>
+                      <a:fillRect/>
+                    </a:stretch>
+                  </pic:blipFill>
+                  <pic:spPr>
+                    <a:xfrm>
+                      <a:off x="0" y="0"/>
+                      <a:ext cx="4305673" cy="723963"/>
+                    </a:xfrm>
+                    <a:prstGeom prst="rect">
+                      <a:avLst/>
+                    </a:prstGeom>
+                  </pic:spPr>
+                </pic:pic>
+              </a:graphicData>
+            </a:graphic>
+          </wp:inline>
+        </w:drawing>
+      </w:r>
+    </w:p>
+    <w:p>
+      <w:pPr>
+        <w:pStyle w:val="Listaconvietas"/>
+        <w:numPr>
+          <w:ilvl w:val="0"/>
+          <w:numId w:val="0"/>
+        </w:numPr>
+        <w:ind w:left="360"/>
+        <w:rPr>
+          <w:rFonts w:ascii="Arial Narrow" w:hAnsi="Arial Narrow"/>
+          <w:bCs/>
+          <w:lang w:val="es-CL"/>
+        </w:rPr>
+      </w:pPr>
+      <w:r>
+        <w:rPr>
+          <w:rFonts w:ascii="Arial Narrow" w:hAnsi="Arial Narrow"/>
+          <w:bCs/>
+          <w:lang w:val="es-CL"/>
+        </w:rPr>
+        <w:drawing>
+          <wp:inline distT="0" distB="0" distL="0" distR="0" wp14:anchorId="08CB46A1" wp14:editId="796131B4">
+            <wp:extent cx="3391194" cy="190517"/>
+            <wp:effectExtent l="0" t="0" r="0" b="0"/>
+            <wp:docPr id="1481434458" name="Imagen 1"/>
+            <wp:cNvGraphicFramePr>
+              <a:graphicFrameLocks xmlns:a="http://schemas.openxmlformats.org/drawingml/2006/main" noChangeAspect="1"/>
+            </wp:cNvGraphicFramePr>
+            <a:graphic xmlns:a="http://schemas.openxmlformats.org/drawingml/2006/main">
+              <a:graphicData uri="http://schemas.openxmlformats.org/drawingml/2006/picture">
+                <pic:pic xmlns:pic="http://schemas.openxmlformats.org/drawingml/2006/picture">
+                  <pic:nvPicPr>
+                    <pic:cNvPr id="1481434458" name=""/>
+                    <pic:cNvPicPr/>
+                  </pic:nvPicPr>
+                  <pic:blipFill>
+                    <a:blip r:embed="rId18"/>
+                    <a:stretch>
+                      <a:fillRect/>
+                    </a:stretch>
+                  </pic:blipFill>
+                  <pic:spPr>
+                    <a:xfrm>
+                      <a:off x="0" y="0"/>
+                      <a:ext cx="3391194" cy="190517"/>
+                    </a:xfrm>
+                    <a:prstGeom prst="rect">
+                      <a:avLst/>
+                    </a:prstGeom>
+                  </pic:spPr>
+                </pic:pic>
+              </a:graphicData>
+            </a:graphic>
+          </wp:inline>
+        </w:drawing>
+      </w:r>
+      <w:r>
+        <w:rPr>
+          <w:rFonts w:ascii="Arial Narrow" w:hAnsi="Arial Narrow"/>
+          <w:bCs/>
+          <w:lang w:val="es-CL"/>
+        </w:rPr>
+        <w:br/>
+      </w:r>
+    </w:p>
+    <w:p>
+      <w:pPr>
+        <w:pStyle w:val="Listaconvietas"/>
+        <w:rPr>
+          <w:rFonts w:ascii="Arial Narrow" w:hAnsi="Arial Narrow"/>
+          <w:bCs/>
+          <w:lang w:val="es-CL"/>
+        </w:rPr>
+      </w:pPr>
+      <w:r>
+        <w:rPr>
+          <w:rFonts w:ascii="Arial Narrow" w:hAnsi="Arial Narrow"/>
+          <w:bCs/>
+          <w:lang w:val="es-CL"/>
+        </w:rPr>
+        <w:t>Mensajes de error por campo y feedback visual (clases CSS).</w:t>
+      </w:r>
+      <w:r>
+        <w:rPr>
+          <w:noProof/>
+        </w:rPr>
+        <w:t xml:space="preserve"> </w:t>
+      </w:r>
+      <w:r>
+        <w:rPr>
+          <w:rFonts w:ascii="Arial Narrow" w:hAnsi="Arial Narrow"/>
+          <w:bCs/>
+          <w:lang w:val="es-CL"/>
+        </w:rPr>
+        <w:drawing>
+          <wp:inline distT="0" distB="0" distL="0" distR="0" wp14:anchorId="7D650484" wp14:editId="276B26A7">
+            <wp:extent cx="3894157" cy="807790"/>
+            <wp:effectExtent l="0" t="0" r="0" b="0"/>
+            <wp:docPr id="1627641911" name="Imagen 1"/>
+            <wp:cNvGraphicFramePr>
+              <a:graphicFrameLocks xmlns:a="http://schemas.openxmlformats.org/drawingml/2006/main" noChangeAspect="1"/>
+            </wp:cNvGraphicFramePr>
+            <a:graphic xmlns:a="http://schemas.openxmlformats.org/drawingml/2006/main">
+              <a:graphicData uri="http://schemas.openxmlformats.org/drawingml/2006/picture">
+                <pic:pic xmlns:pic="http://schemas.openxmlformats.org/drawingml/2006/picture">
+                  <pic:nvPicPr>
+                    <pic:cNvPr id="1627641911" name=""/>
+                    <pic:cNvPicPr/>
+                  </pic:nvPicPr>
+                  <pic:blipFill>
+                    <a:blip r:embed="rId19"/>
+                    <a:stretch>
+                      <a:fillRect/>
+                    </a:stretch>
+                  </pic:blipFill>
+                  <pic:spPr>
+                    <a:xfrm>
+                      <a:off x="0" y="0"/>
+                      <a:ext cx="3894157" cy="807790"/>
+                    </a:xfrm>
+                    <a:prstGeom prst="rect">
+                      <a:avLst/>
+                    </a:prstGeom>
+                  </pic:spPr>
+                </pic:pic>
+              </a:graphicData>
+            </a:graphic>
+          </wp:inline>
+        </w:drawing>
+      </w:r>
+      <w:r>
+        <w:rPr>
+          <w:rFonts w:ascii="Arial Narrow" w:hAnsi="Arial Narrow"/>
+          <w:bCs/>
+          <w:lang w:val="es-CL"/>
+        </w:rPr>
+        <w:br/>
+      </w:r>
+      <w:r>
+        <w:rPr>
+          <w:rFonts w:ascii="Arial Narrow" w:hAnsi="Arial Narrow"/>
+          <w:bCs/>
+          <w:lang w:val="es-CL"/>
+        </w:rPr>
+        <w:drawing>
+          <wp:inline distT="0" distB="0" distL="0" distR="0" wp14:anchorId="564C95EF" wp14:editId="2303FD0F">
+            <wp:extent cx="3865069" cy="1012056"/>
+            <wp:effectExtent l="0" t="0" r="2540" b="0"/>
+            <wp:docPr id="543996394" name="Imagen 1"/>
+            <wp:cNvGraphicFramePr>
+              <a:graphicFrameLocks xmlns:a="http://schemas.openxmlformats.org/drawingml/2006/main" noChangeAspect="1"/>
+            </wp:cNvGraphicFramePr>
+            <a:graphic xmlns:a="http://schemas.openxmlformats.org/drawingml/2006/main">
+              <a:graphicData uri="http://schemas.openxmlformats.org/drawingml/2006/picture">
+                <pic:pic xmlns:pic="http://schemas.openxmlformats.org/drawingml/2006/picture">
+                  <pic:nvPicPr>
+                    <pic:cNvPr id="543996394" name=""/>
+                    <pic:cNvPicPr/>
+                  </pic:nvPicPr>
+                  <pic:blipFill rotWithShape="1">
+                    <a:blip r:embed="rId20"/>
+                    <a:srcRect l="12342" r="9065"/>
+                    <a:stretch>
+                      <a:fillRect/>
+                    </a:stretch>
+                  </pic:blipFill>
+                  <pic:spPr bwMode="auto">
+                    <a:xfrm>
+                      <a:off x="0" y="0"/>
+                      <a:ext cx="3936455" cy="1030748"/>
+                    </a:xfrm>
+                    <a:prstGeom prst="rect">
+                      <a:avLst/>
+                    </a:prstGeom>
+                    <a:ln>
+                      <a:noFill/>
+                    </a:ln>
+                    <a:extLst>
+                      <a:ext uri="{53640926-AAD7-44D8-BBD7-CCE9431645EC}">
+                        <a14:shadowObscured xmlns:a14="http://schemas.microsoft.com/office/drawing/2010/main"/>
+                      </a:ext>
+                    </a:extLst>
+                  </pic:spPr>
+                </pic:pic>
+              </a:graphicData>
+            </a:graphic>
+          </wp:inline>
+        </w:drawing>
+      </w:r>
+    </w:p>
+    <w:p>
+      <w:pPr>
+        <w:pStyle w:val="Listaconvietas"/>
+        <w:rPr>
+          <w:rFonts w:ascii="Arial Narrow" w:hAnsi="Arial Narrow"/>
+          <w:bCs/>
+          <w:lang w:val="es-CL"/>
+        </w:rPr>
+      </w:pPr>
+      <w:r>
+        <w:rPr>
+          <w:rFonts w:ascii="Arial Narrow" w:hAnsi="Arial Narrow"/>
+          <w:bCs/>
+          <w:lang w:val="es-CL"/>
+        </w:rPr>
+        <w:t>Prevención de envío cuando existan errores (preventDefault).</w:t>
+      </w:r>
+      <w:r>
+        <w:rPr>
+          <w:rFonts w:ascii="Arial Narrow" w:hAnsi="Arial Narrow"/>
+          <w:bCs/>
+          <w:lang w:val="es-CL"/>
+        </w:rPr>
+        <w:br/>
+      </w:r>
+      <w:r>
+        <w:rPr>
+          <w:noProof/>
+        </w:rPr>
+        <w:drawing>
+          <wp:inline distT="0" distB="0" distL="0" distR="0" wp14:anchorId="0C3AFC34" wp14:editId="4DEA0220">
+            <wp:extent cx="4476190" cy="571429"/>
+            <wp:effectExtent l="0" t="0" r="635" b="635"/>
+            <wp:docPr id="1018683282" name="Imagen 1"/>
+            <wp:cNvGraphicFramePr>
+              <a:graphicFrameLocks xmlns:a="http://schemas.openxmlformats.org/drawingml/2006/main" noChangeAspect="1"/>
+            </wp:cNvGraphicFramePr>
+            <a:graphic xmlns:a="http://schemas.openxmlformats.org/drawingml/2006/main">
+              <a:graphicData uri="http://schemas.openxmlformats.org/drawingml/2006/picture">
+                <pic:pic xmlns:pic="http://schemas.openxmlformats.org/drawingml/2006/picture">
+                  <pic:nvPicPr>
+                    <pic:cNvPr id="1018683282" name=""/>
+                    <pic:cNvPicPr/>
+                  </pic:nvPicPr>
+                  <pic:blipFill>
+                    <a:blip r:embed="rId21"/>
+                    <a:stretch>
+                      <a:fillRect/>
+                    </a:stretch>
+                  </pic:blipFill>
+                  <pic:spPr>
+                    <a:xfrm>
+                      <a:off x="0" y="0"/>
+                      <a:ext cx="4476190" cy="571429"/>
+                    </a:xfrm>
+                    <a:prstGeom prst="rect">
+                      <a:avLst/>
+                    </a:prstGeom>
+                  </pic:spPr>
+                </pic:pic>
+              </a:graphicData>
+            </a:graphic>
+          </wp:inline>
+        </w:drawing>
       </w:r>
     </w:p>
     <w:p>
@@ -850,119 +1168,33 @@
           <w:sz w:val="22"/>
           <w:szCs w:val="22"/>
         </w:rPr>
-        <w:lastRenderedPageBreak/>
         <w:t>Datos y persistencia (obligatorio — una opción)</w:t>
-      </w:r>
-    </w:p>
-    <w:p>
-      <w:pPr>
-        <w:pStyle w:val="Listaconvietas"/>
-        <w:rPr>
-          <w:rFonts w:ascii="Arial Narrow" w:hAnsi="Arial Narrow"/>
-          <w:bCs/>
-          <w:lang w:val="es-CL"/>
-        </w:rPr>
-      </w:pPr>
-      <w:r>
-        <w:rPr>
-          <w:rFonts w:ascii="Arial Narrow" w:hAnsi="Arial Narrow"/>
-          <w:bCs/>
-          <w:lang w:val="es-CL"/>
-        </w:rPr>
-        <w:t xml:space="preserve">Opción 1: Persistencia en </w:t>
-      </w:r>
-      <w:proofErr w:type="spellStart"/>
-      <w:r>
-        <w:rPr>
-          <w:rFonts w:ascii="Arial Narrow" w:hAnsi="Arial Narrow"/>
-          <w:bCs/>
-          <w:lang w:val="es-CL"/>
-        </w:rPr>
-        <w:t>LocalStorage</w:t>
-      </w:r>
-      <w:proofErr w:type="spellEnd"/>
-      <w:r>
-        <w:rPr>
-          <w:rFonts w:ascii="Arial Narrow" w:hAnsi="Arial Narrow"/>
-          <w:bCs/>
-          <w:lang w:val="es-CL"/>
-        </w:rPr>
-        <w:t xml:space="preserve"> (guardar y recuperar datos de la app).</w:t>
-      </w:r>
-    </w:p>
-    <w:p>
-      <w:pPr>
-        <w:pStyle w:val="Listaconvietas"/>
-        <w:rPr>
-          <w:rFonts w:ascii="Arial Narrow" w:hAnsi="Arial Narrow"/>
-          <w:bCs/>
-          <w:lang w:val="es-CL"/>
-        </w:rPr>
-      </w:pPr>
-      <w:r>
-        <w:rPr>
-          <w:rFonts w:ascii="Arial Narrow" w:hAnsi="Arial Narrow"/>
-          <w:bCs/>
-          <w:lang w:val="es-CL"/>
-        </w:rPr>
-        <w:t xml:space="preserve">Opción 2: </w:t>
-      </w:r>
-      <w:r>
-        <w:rPr>
-          <w:rFonts w:ascii="Arial Narrow" w:hAnsi="Arial Narrow"/>
-          <w:lang w:val="es-CL"/>
-        </w:rPr>
-        <w:t>Consumo</w:t>
-      </w:r>
-      <w:r>
-        <w:rPr>
-          <w:rFonts w:ascii="Arial Narrow" w:hAnsi="Arial Narrow"/>
-          <w:bCs/>
-          <w:lang w:val="es-CL"/>
-        </w:rPr>
-        <w:t xml:space="preserve"> de datos con Fetch a un JSON local (archivo .</w:t>
-      </w:r>
-      <w:proofErr w:type="spellStart"/>
-      <w:r>
-        <w:rPr>
-          <w:rFonts w:ascii="Arial Narrow" w:hAnsi="Arial Narrow"/>
-          <w:bCs/>
-          <w:lang w:val="es-CL"/>
-        </w:rPr>
-        <w:t>json</w:t>
-      </w:r>
-      <w:proofErr w:type="spellEnd"/>
-      <w:r>
-        <w:rPr>
-          <w:rFonts w:ascii="Arial Narrow" w:hAnsi="Arial Narrow"/>
-          <w:bCs/>
-          <w:lang w:val="es-CL"/>
-        </w:rPr>
-        <w:t xml:space="preserve">) o </w:t>
-      </w:r>
-      <w:proofErr w:type="spellStart"/>
-      <w:r>
-        <w:rPr>
-          <w:rFonts w:ascii="Arial Narrow" w:hAnsi="Arial Narrow"/>
-          <w:bCs/>
-          <w:lang w:val="es-CL"/>
-        </w:rPr>
-        <w:t>endpoint</w:t>
-      </w:r>
-      <w:proofErr w:type="spellEnd"/>
-      <w:r>
-        <w:rPr>
-          <w:rFonts w:ascii="Arial Narrow" w:hAnsi="Arial Narrow"/>
-          <w:bCs/>
-          <w:lang w:val="es-CL"/>
-        </w:rPr>
-        <w:t xml:space="preserve"> público de prueba (sin autenticación).</w:t>
       </w:r>
     </w:p>
     <w:p>
       <w:pPr>
         <w:spacing w:after="120"/>
         <w:jc w:val="both"/>
+        <w:rPr>
+          <w:rFonts w:ascii="Arial Narrow" w:hAnsi="Arial Narrow"/>
+          <w:bCs/>
+          <w:sz w:val="22"/>
+          <w:szCs w:val="22"/>
+        </w:rPr>
+      </w:pPr>
+      <w:r>
+        <w:rPr>
+          <w:rFonts w:ascii="Arial Narrow" w:hAnsi="Arial Narrow"/>
+          <w:bCs/>
+          <w:sz w:val="22"/>
+          <w:szCs w:val="22"/>
+        </w:rPr>
+        <w:t xml:space="preserve">Enviamos los datos por json al backend utilizando api fetch. </w:t>
+      </w:r>
+    </w:p>
+    <w:p>
+      <w:pPr>
+        <w:spacing w:after="120"/>
         <w:rPr>
           <w:rFonts w:ascii="Arial Narrow" w:hAnsi="Arial Narrow"/>
           <w:b/>
@@ -977,101 +1209,71 @@
           <w:sz w:val="22"/>
           <w:szCs w:val="22"/>
         </w:rPr>
-        <w:t>Usabilidad y calidad (obligatorio)</w:t>
-      </w:r>
-    </w:p>
-    <w:p>
-      <w:pPr>
-        <w:pStyle w:val="Listaconvietas"/>
-        <w:rPr>
-          <w:rFonts w:ascii="Arial Narrow" w:hAnsi="Arial Narrow"/>
-          <w:bCs/>
-          <w:lang w:val="es-CL"/>
-        </w:rPr>
-      </w:pPr>
-      <w:r>
-        <w:rPr>
-          <w:rFonts w:ascii="Arial Narrow" w:hAnsi="Arial Narrow"/>
-          <w:lang w:val="es-CL"/>
-        </w:rPr>
-        <w:t>Compatibilidad</w:t>
-      </w:r>
-      <w:r>
-        <w:rPr>
-          <w:rFonts w:ascii="Arial Narrow" w:hAnsi="Arial Narrow"/>
-          <w:bCs/>
-          <w:lang w:val="es-CL"/>
-        </w:rPr>
-        <w:t>: probar en al menos 2 navegadores (Chrome/Edge/Firefox) o 2 tamaños de pantalla (responsive básico).</w:t>
-      </w:r>
-    </w:p>
-    <w:p>
-      <w:pPr>
-        <w:pStyle w:val="Listaconvietas"/>
-        <w:rPr>
-          <w:rFonts w:ascii="Arial Narrow" w:hAnsi="Arial Narrow"/>
-          <w:bCs/>
-          <w:lang w:val="es-CL"/>
-        </w:rPr>
-      </w:pPr>
-      <w:r>
-        <w:rPr>
-          <w:rFonts w:ascii="Arial Narrow" w:hAnsi="Arial Narrow"/>
-          <w:bCs/>
-          <w:lang w:val="es-CL"/>
-        </w:rPr>
-        <w:t>Sin errores críticos en consola (</w:t>
-      </w:r>
-      <w:proofErr w:type="spellStart"/>
-      <w:r>
-        <w:rPr>
-          <w:rFonts w:ascii="Arial Narrow" w:hAnsi="Arial Narrow"/>
-          <w:bCs/>
-          <w:lang w:val="es-CL"/>
-        </w:rPr>
-        <w:t>DevTools</w:t>
-      </w:r>
-      <w:proofErr w:type="spellEnd"/>
-      <w:r>
-        <w:rPr>
-          <w:rFonts w:ascii="Arial Narrow" w:hAnsi="Arial Narrow"/>
-          <w:bCs/>
-          <w:lang w:val="es-CL"/>
-        </w:rPr>
-        <w:t>).</w:t>
-      </w:r>
-    </w:p>
-    <w:p>
-      <w:pPr>
-        <w:pStyle w:val="Listaconvietas"/>
-        <w:rPr>
-          <w:rFonts w:ascii="Arial Narrow" w:hAnsi="Arial Narrow"/>
-          <w:bCs/>
-          <w:lang w:val="es-CL"/>
-        </w:rPr>
-      </w:pPr>
-      <w:r>
-        <w:rPr>
-          <w:rFonts w:ascii="Arial Narrow" w:hAnsi="Arial Narrow"/>
-          <w:bCs/>
-          <w:lang w:val="es-CL"/>
-        </w:rPr>
-        <w:t xml:space="preserve">Código </w:t>
-      </w:r>
-      <w:r>
-        <w:rPr>
-          <w:rFonts w:ascii="Arial Narrow" w:hAnsi="Arial Narrow"/>
-          <w:lang w:val="es-CL"/>
-        </w:rPr>
-        <w:t>ordenado</w:t>
-      </w:r>
-      <w:r>
-        <w:rPr>
-          <w:rFonts w:ascii="Arial Narrow" w:hAnsi="Arial Narrow"/>
-          <w:bCs/>
-          <w:lang w:val="es-CL"/>
-        </w:rPr>
-        <w:t>: nombres claros, funciones reutilizables, comentarios solo donde aporten.</w:t>
+        <w:lastRenderedPageBreak/>
+        <w:drawing>
+          <wp:inline distT="0" distB="0" distL="0" distR="0" wp14:anchorId="717339BA" wp14:editId="6C7A875C">
+            <wp:extent cx="5235394" cy="929721"/>
+            <wp:effectExtent l="0" t="0" r="3810" b="3810"/>
+            <wp:docPr id="475263129" name="Imagen 1"/>
+            <wp:cNvGraphicFramePr>
+              <a:graphicFrameLocks xmlns:a="http://schemas.openxmlformats.org/drawingml/2006/main" noChangeAspect="1"/>
+            </wp:cNvGraphicFramePr>
+            <a:graphic xmlns:a="http://schemas.openxmlformats.org/drawingml/2006/main">
+              <a:graphicData uri="http://schemas.openxmlformats.org/drawingml/2006/picture">
+                <pic:pic xmlns:pic="http://schemas.openxmlformats.org/drawingml/2006/picture">
+                  <pic:nvPicPr>
+                    <pic:cNvPr id="475263129" name=""/>
+                    <pic:cNvPicPr/>
+                  </pic:nvPicPr>
+                  <pic:blipFill>
+                    <a:blip r:embed="rId22"/>
+                    <a:stretch>
+                      <a:fillRect/>
+                    </a:stretch>
+                  </pic:blipFill>
+                  <pic:spPr>
+                    <a:xfrm>
+                      <a:off x="0" y="0"/>
+                      <a:ext cx="5235394" cy="929721"/>
+                    </a:xfrm>
+                    <a:prstGeom prst="rect">
+                      <a:avLst/>
+                    </a:prstGeom>
+                  </pic:spPr>
+                </pic:pic>
+              </a:graphicData>
+            </a:graphic>
+          </wp:inline>
+        </w:drawing>
+      </w:r>
+    </w:p>
+    <w:p>
+      <w:pPr>
+        <w:spacing w:after="120"/>
+        <w:rPr>
+          <w:rFonts w:ascii="Arial Narrow" w:hAnsi="Arial Narrow"/>
+          <w:bCs/>
+          <w:sz w:val="22"/>
+          <w:szCs w:val="22"/>
+        </w:rPr>
+      </w:pPr>
+      <w:r>
+        <w:rPr>
+          <w:rFonts w:ascii="Arial Narrow" w:hAnsi="Arial Narrow"/>
+          <w:bCs/>
+          <w:sz w:val="22"/>
+          <w:szCs w:val="22"/>
+        </w:rPr>
+        <w:t>además</w:t>
+      </w:r>
+      <w:r>
+        <w:rPr>
+          <w:rFonts w:ascii="Arial Narrow" w:hAnsi="Arial Narrow"/>
+          <w:bCs/>
+          <w:sz w:val="22"/>
+          <w:szCs w:val="22"/>
+        </w:rPr>
+        <w:t xml:space="preserve"> para cargar los comentarios recibimos la información para luego crear elementos que lo muestren.</w:t>
       </w:r>
     </w:p>
     <w:p>
@@ -1085,7 +1287,6 @@
           <w:szCs w:val="22"/>
         </w:rPr>
       </w:pPr>
-      <w:proofErr w:type="spellStart"/>
       <w:r>
         <w:rPr>
           <w:rFonts w:ascii="Arial Narrow" w:hAnsi="Arial Narrow"/>
@@ -1093,17 +1294,98 @@
           <w:sz w:val="22"/>
           <w:szCs w:val="22"/>
         </w:rPr>
-        <w:t>Versionamiento</w:t>
-      </w:r>
-      <w:proofErr w:type="spellEnd"/>
-      <w:r>
+        <w:drawing>
+          <wp:inline distT="0" distB="0" distL="0" distR="0" wp14:anchorId="3E02EDA9" wp14:editId="36B42BED">
+            <wp:extent cx="4419983" cy="731583"/>
+            <wp:effectExtent l="0" t="0" r="0" b="0"/>
+            <wp:docPr id="1728526676" name="Imagen 1"/>
+            <wp:cNvGraphicFramePr>
+              <a:graphicFrameLocks xmlns:a="http://schemas.openxmlformats.org/drawingml/2006/main" noChangeAspect="1"/>
+            </wp:cNvGraphicFramePr>
+            <a:graphic xmlns:a="http://schemas.openxmlformats.org/drawingml/2006/main">
+              <a:graphicData uri="http://schemas.openxmlformats.org/drawingml/2006/picture">
+                <pic:pic xmlns:pic="http://schemas.openxmlformats.org/drawingml/2006/picture">
+                  <pic:nvPicPr>
+                    <pic:cNvPr id="1728526676" name=""/>
+                    <pic:cNvPicPr/>
+                  </pic:nvPicPr>
+                  <pic:blipFill>
+                    <a:blip r:embed="rId23"/>
+                    <a:stretch>
+                      <a:fillRect/>
+                    </a:stretch>
+                  </pic:blipFill>
+                  <pic:spPr>
+                    <a:xfrm>
+                      <a:off x="0" y="0"/>
+                      <a:ext cx="4419983" cy="731583"/>
+                    </a:xfrm>
+                    <a:prstGeom prst="rect">
+                      <a:avLst/>
+                    </a:prstGeom>
+                  </pic:spPr>
+                </pic:pic>
+              </a:graphicData>
+            </a:graphic>
+          </wp:inline>
+        </w:drawing>
+      </w:r>
+    </w:p>
+    <w:p>
+      <w:pPr>
+        <w:spacing w:after="120"/>
+        <w:jc w:val="both"/>
         <w:rPr>
           <w:rFonts w:ascii="Arial Narrow" w:hAnsi="Arial Narrow"/>
           <w:b/>
           <w:sz w:val="22"/>
           <w:szCs w:val="22"/>
         </w:rPr>
-        <w:t xml:space="preserve"> y entrega (obligatorio)</w:t>
+      </w:pPr>
+    </w:p>
+    <w:p>
+      <w:pPr>
+        <w:spacing w:after="120"/>
+        <w:jc w:val="both"/>
+        <w:rPr>
+          <w:rFonts w:ascii="Arial Narrow" w:hAnsi="Arial Narrow"/>
+          <w:b/>
+          <w:sz w:val="22"/>
+          <w:szCs w:val="22"/>
+        </w:rPr>
+      </w:pPr>
+    </w:p>
+    <w:p>
+      <w:pPr>
+        <w:spacing w:after="120"/>
+        <w:jc w:val="both"/>
+        <w:rPr>
+          <w:rFonts w:ascii="Arial Narrow" w:hAnsi="Arial Narrow"/>
+          <w:b/>
+          <w:sz w:val="22"/>
+          <w:szCs w:val="22"/>
+        </w:rPr>
+      </w:pPr>
+    </w:p>
+    <w:p>
+      <w:pPr>
+        <w:spacing w:after="120"/>
+        <w:jc w:val="both"/>
+        <w:rPr>
+          <w:rFonts w:ascii="Arial Narrow" w:hAnsi="Arial Narrow"/>
+          <w:b/>
+          <w:sz w:val="22"/>
+          <w:szCs w:val="22"/>
+        </w:rPr>
+      </w:pPr>
+      <w:r>
+        <w:rPr>
+          <w:rFonts w:ascii="Arial Narrow" w:hAnsi="Arial Narrow"/>
+          <w:b/>
+          <w:sz w:val="22"/>
+          <w:szCs w:val="22"/>
+        </w:rPr>
+        <w:t>Usabilidad y calidad (obligatorio)</w:t>
       </w:r>
     </w:p>
     <w:p>
@@ -1118,46 +1400,17 @@
       <w:r>
         <w:rPr>
           <w:rFonts w:ascii="Arial Narrow" w:hAnsi="Arial Narrow"/>
-          <w:bCs/>
-          <w:lang w:val="es-CL"/>
-        </w:rPr>
-        <w:t xml:space="preserve">Repositorio GitHub con </w:t>
-      </w:r>
-      <w:proofErr w:type="spellStart"/>
-      <w:r>
-        <w:rPr>
-          <w:rFonts w:ascii="Arial Narrow" w:hAnsi="Arial Narrow"/>
-          <w:bCs/>
-          <w:lang w:val="es-CL"/>
-        </w:rPr>
-        <w:t>commits</w:t>
-      </w:r>
-      <w:proofErr w:type="spellEnd"/>
-      <w:r>
-        <w:rPr>
-          <w:rFonts w:ascii="Arial Narrow" w:hAnsi="Arial Narrow"/>
-          <w:bCs/>
-          <w:lang w:val="es-CL"/>
-        </w:rPr>
-        <w:t xml:space="preserve"> por avance (mínimo 4 </w:t>
-      </w:r>
-      <w:proofErr w:type="spellStart"/>
-      <w:r>
-        <w:rPr>
-          <w:rFonts w:ascii="Arial Narrow" w:hAnsi="Arial Narrow"/>
-          <w:bCs/>
-          <w:lang w:val="es-CL"/>
-        </w:rPr>
-        <w:t>commits</w:t>
-      </w:r>
-      <w:proofErr w:type="spellEnd"/>
-      <w:r>
-        <w:rPr>
-          <w:rFonts w:ascii="Arial Narrow" w:hAnsi="Arial Narrow"/>
-          <w:bCs/>
-          <w:lang w:val="es-CL"/>
-        </w:rPr>
-        <w:t>).</w:t>
+          <w:lang w:val="es-CL"/>
+        </w:rPr>
+        <w:t>Compatibilidad</w:t>
+      </w:r>
+      <w:r>
+        <w:rPr>
+          <w:rFonts w:ascii="Arial Narrow" w:hAnsi="Arial Narrow"/>
+          <w:bCs/>
+          <w:lang w:val="es-CL"/>
+        </w:rPr>
+        <w:t>: probar en al menos 2 navegadores (Chrome/Edge/Firefox) o 2 tamaños de pantalla (responsive básico).</w:t>
       </w:r>
     </w:p>
     <w:p>
@@ -1175,7 +1428,7 @@
           <w:bCs/>
           <w:lang w:val="es-CL"/>
         </w:rPr>
-        <w:t>README con: objetivo, requerimientos cumplidos, instrucciones de ejecución y evidencias (capturas).</w:t>
+        <w:t>Sin errores críticos en consola (DevTools).</w:t>
       </w:r>
     </w:p>
     <w:p>
@@ -1190,17 +1443,267 @@
       <w:r>
         <w:rPr>
           <w:rFonts w:ascii="Arial Narrow" w:hAnsi="Arial Narrow"/>
-          <w:lang w:val="es-CL"/>
-        </w:rPr>
-        <w:t>Demostración</w:t>
-      </w:r>
-      <w:r>
-        <w:rPr>
-          <w:rFonts w:ascii="Arial Narrow" w:hAnsi="Arial Narrow"/>
-          <w:bCs/>
-          <w:lang w:val="es-CL"/>
-        </w:rPr>
-        <w:t xml:space="preserve"> breve al docente (o al curso, según indique).</w:t>
+          <w:bCs/>
+          <w:lang w:val="es-CL"/>
+        </w:rPr>
+        <w:t xml:space="preserve">Código </w:t>
+      </w:r>
+      <w:r>
+        <w:rPr>
+          <w:rFonts w:ascii="Arial Narrow" w:hAnsi="Arial Narrow"/>
+          <w:lang w:val="es-CL"/>
+        </w:rPr>
+        <w:t>ordenado</w:t>
+      </w:r>
+      <w:r>
+        <w:rPr>
+          <w:rFonts w:ascii="Arial Narrow" w:hAnsi="Arial Narrow"/>
+          <w:bCs/>
+          <w:lang w:val="es-CL"/>
+        </w:rPr>
+        <w:t>: nombres claros, funciones reutilizables, comentarios solo donde aporten.</w:t>
+      </w:r>
+    </w:p>
+    <w:p>
+      <w:pPr>
+        <w:rPr>
+          <w:rFonts w:ascii="Arial Narrow" w:hAnsi="Arial Narrow"/>
+          <w:sz w:val="22"/>
+          <w:szCs w:val="22"/>
+        </w:rPr>
+      </w:pPr>
+      <w:r>
+        <w:rPr>
+          <w:rFonts w:ascii="Arial Narrow" w:hAnsi="Arial Narrow"/>
+          <w:b/>
+          <w:sz w:val="22"/>
+          <w:szCs w:val="22"/>
+        </w:rPr>
+        <w:t>V. PREGUNTAS DE CIERRE (para reflexión breve)</w:t>
+      </w:r>
+    </w:p>
+    <w:p>
+      <w:pPr>
+        <w:pStyle w:val="Listaconnmeros"/>
+        <w:numPr>
+          <w:ilvl w:val="0"/>
+          <w:numId w:val="4"/>
+        </w:numPr>
+        <w:rPr>
+          <w:rFonts w:ascii="Arial Narrow" w:hAnsi="Arial Narrow"/>
+          <w:lang w:val="es-CL"/>
+        </w:rPr>
+      </w:pPr>
+      <w:r>
+        <w:rPr>
+          <w:rFonts w:ascii="Arial Narrow" w:hAnsi="Arial Narrow"/>
+          <w:b/>
+          <w:bCs/>
+          <w:lang w:val="es-CL"/>
+        </w:rPr>
+        <w:t>¿Qué validación fue la más compleja y cómo la resolviste?</w:t>
+      </w:r>
+      <w:r>
+        <w:rPr>
+          <w:rFonts w:ascii="Arial Narrow" w:hAnsi="Arial Narrow"/>
+          <w:lang w:val="es-CL"/>
+        </w:rPr>
+        <w:br/>
+        <w:t xml:space="preserve">La validación asíncrona para saber si </w:t>
+      </w:r>
+      <w:r>
+        <w:rPr>
+          <w:rFonts w:ascii="Arial Narrow" w:hAnsi="Arial Narrow"/>
+          <w:lang w:val="es-CL"/>
+        </w:rPr>
+        <w:t>está</w:t>
+      </w:r>
+      <w:r>
+        <w:rPr>
+          <w:rFonts w:ascii="Arial Narrow" w:hAnsi="Arial Narrow"/>
+          <w:lang w:val="es-CL"/>
+        </w:rPr>
+        <w:t xml:space="preserve"> disponible</w:t>
+      </w:r>
+      <w:r>
+        <w:rPr>
+          <w:rFonts w:ascii="Arial Narrow" w:hAnsi="Arial Narrow"/>
+          <w:lang w:val="es-CL"/>
+        </w:rPr>
+        <w:t xml:space="preserve"> en tiempo real </w:t>
+      </w:r>
+      <w:r>
+        <w:rPr>
+          <w:rFonts w:ascii="Arial Narrow" w:hAnsi="Arial Narrow"/>
+          <w:lang w:val="es-CL"/>
+        </w:rPr>
+        <w:t>en el archivo de registro. Agregue un en</w:t>
+      </w:r>
+      <w:r>
+        <w:rPr>
+          <w:rFonts w:ascii="Arial Narrow" w:hAnsi="Arial Narrow"/>
+          <w:lang w:val="es-CL"/>
+        </w:rPr>
+        <w:t>d</w:t>
+      </w:r>
+      <w:r>
+        <w:rPr>
+          <w:rFonts w:ascii="Arial Narrow" w:hAnsi="Arial Narrow"/>
+          <w:lang w:val="es-CL"/>
+        </w:rPr>
+        <w:t>point que utiliza fech en el evento input, este devuelve true o fals</w:t>
+      </w:r>
+      <w:r>
+        <w:rPr>
+          <w:rFonts w:ascii="Arial Narrow" w:hAnsi="Arial Narrow"/>
+          <w:lang w:val="es-CL"/>
+        </w:rPr>
+        <w:t>e</w:t>
+      </w:r>
+      <w:r>
+        <w:rPr>
+          <w:rFonts w:ascii="Arial Narrow" w:hAnsi="Arial Narrow"/>
+          <w:lang w:val="es-CL"/>
+        </w:rPr>
+        <w:t>.</w:t>
+      </w:r>
+      <w:r>
+        <w:rPr>
+          <w:rFonts w:ascii="Arial Narrow" w:hAnsi="Arial Narrow"/>
+          <w:lang w:val="es-CL"/>
+        </w:rPr>
+        <w:br/>
+      </w:r>
+    </w:p>
+    <w:p>
+      <w:pPr>
+        <w:pStyle w:val="Listaconnmeros"/>
+        <w:numPr>
+          <w:ilvl w:val="0"/>
+          <w:numId w:val="4"/>
+        </w:numPr>
+        <w:rPr>
+          <w:rFonts w:ascii="Arial Narrow" w:hAnsi="Arial Narrow"/>
+          <w:lang w:val="es-CL"/>
+        </w:rPr>
+      </w:pPr>
+      <w:r>
+        <w:rPr>
+          <w:rFonts w:ascii="Arial Narrow" w:hAnsi="Arial Narrow"/>
+          <w:b/>
+          <w:bCs/>
+          <w:lang w:val="es-CL"/>
+        </w:rPr>
+        <w:t>¿Qué parte del DOM te permitió mejorar más la experiencia de usuario?</w:t>
+      </w:r>
+      <w:r>
+        <w:rPr>
+          <w:rFonts w:ascii="Arial Narrow" w:hAnsi="Arial Narrow"/>
+          <w:lang w:val="es-CL"/>
+        </w:rPr>
+        <w:br/>
+        <w:t>Claramente que la validación</w:t>
+      </w:r>
+      <w:r>
+        <w:rPr>
+          <w:rFonts w:ascii="Arial Narrow" w:hAnsi="Arial Narrow"/>
+          <w:lang w:val="es-CL"/>
+        </w:rPr>
+        <w:t>,</w:t>
+      </w:r>
+      <w:r>
+        <w:rPr>
+          <w:rFonts w:ascii="Arial Narrow" w:hAnsi="Arial Narrow"/>
+          <w:lang w:val="es-CL"/>
+        </w:rPr>
+        <w:t xml:space="preserve"> </w:t>
+      </w:r>
+      <w:r>
+        <w:rPr>
+          <w:rFonts w:ascii="Arial Narrow" w:hAnsi="Arial Narrow"/>
+          <w:lang w:val="es-CL"/>
+        </w:rPr>
+        <w:t>datos</w:t>
+      </w:r>
+      <w:r>
+        <w:rPr>
+          <w:rFonts w:ascii="Arial Narrow" w:hAnsi="Arial Narrow"/>
+          <w:lang w:val="es-CL"/>
+        </w:rPr>
+        <w:t xml:space="preserve"> muestra en tiempo real cambios </w:t>
+      </w:r>
+      <w:r>
+        <w:rPr>
+          <w:rFonts w:ascii="Arial Narrow" w:hAnsi="Arial Narrow"/>
+          <w:lang w:val="es-CL"/>
+        </w:rPr>
+        <w:t>erróneos</w:t>
+      </w:r>
+      <w:r>
+        <w:rPr>
+          <w:rFonts w:ascii="Arial Narrow" w:hAnsi="Arial Narrow"/>
+          <w:lang w:val="es-CL"/>
+        </w:rPr>
+        <w:t xml:space="preserve"> marcándolos con color rojo o si esta correcto de color verde</w:t>
+      </w:r>
+      <w:r>
+        <w:rPr>
+          <w:rFonts w:ascii="Arial Narrow" w:hAnsi="Arial Narrow"/>
+          <w:lang w:val="es-CL"/>
+        </w:rPr>
+        <w:t>, además de agregar un mensaje span de aprobación si es que cumple o no, para mi siento que mejora la UX</w:t>
+      </w:r>
+      <w:r>
+        <w:rPr>
+          <w:rFonts w:ascii="Arial Narrow" w:hAnsi="Arial Narrow"/>
+          <w:lang w:val="es-CL"/>
+        </w:rPr>
+        <w:t>.</w:t>
+      </w:r>
+      <w:r>
+        <w:rPr>
+          <w:rFonts w:ascii="Arial Narrow" w:hAnsi="Arial Narrow"/>
+          <w:lang w:val="es-CL"/>
+        </w:rPr>
+        <w:br/>
+      </w:r>
+    </w:p>
+    <w:p>
+      <w:pPr>
+        <w:pStyle w:val="Listaconnmeros"/>
+        <w:numPr>
+          <w:ilvl w:val="0"/>
+          <w:numId w:val="4"/>
+        </w:numPr>
+        <w:rPr>
+          <w:rFonts w:ascii="Arial Narrow" w:hAnsi="Arial Narrow"/>
+          <w:lang w:val="es-CL"/>
+        </w:rPr>
+      </w:pPr>
+      <w:r>
+        <w:rPr>
+          <w:rFonts w:ascii="Arial Narrow" w:hAnsi="Arial Narrow"/>
+          <w:b/>
+          <w:bCs/>
+          <w:lang w:val="es-CL"/>
+        </w:rPr>
+        <w:t>Si tuvieras 2 horas más, ¿qué mejora implementarías y por qué?</w:t>
+      </w:r>
+      <w:r>
+        <w:rPr>
+          <w:rFonts w:ascii="Arial Narrow" w:hAnsi="Arial Narrow"/>
+          <w:b/>
+          <w:bCs/>
+          <w:lang w:val="es-CL"/>
+        </w:rPr>
+        <w:br/>
+      </w:r>
+      <w:r>
+        <w:rPr>
+          <w:rFonts w:ascii="Arial Narrow" w:hAnsi="Arial Narrow"/>
+          <w:lang w:val="es-CL"/>
+        </w:rPr>
+        <w:t>Me encargaría de limpiar los endpoins y comentar el código, no se logra entender fácilmente que es lo que intento hacer por código, me encargaría de crear un apartado para cada película e incluir comentarios con la librería socket.io que complemente el formulario de críticas para cada película.</w:t>
       </w:r>
     </w:p>
     <w:p>
@@ -1220,185 +1723,6 @@
     </w:p>
     <w:p>
       <w:pPr>
-        <w:pStyle w:val="Prrafodelista"/>
-        <w:numPr>
-          <w:ilvl w:val="0"/>
-          <w:numId w:val="1"/>
-        </w:numPr>
-        <w:ind w:left="284" w:hanging="284"/>
-        <w:contextualSpacing w:val="0"/>
-        <w:jc w:val="both"/>
-        <w:rPr>
-          <w:rFonts w:ascii="Arial Narrow" w:hAnsi="Arial Narrow"/>
-          <w:sz w:val="22"/>
-          <w:szCs w:val="22"/>
-        </w:rPr>
-      </w:pPr>
-      <w:r>
-        <w:rPr>
-          <w:rFonts w:ascii="Arial Narrow" w:hAnsi="Arial Narrow"/>
-          <w:b/>
-          <w:sz w:val="22"/>
-          <w:szCs w:val="22"/>
-        </w:rPr>
-        <w:t>ENTREGABLES</w:t>
-      </w:r>
-    </w:p>
-    <w:p>
-      <w:pPr>
-        <w:pStyle w:val="Listaconnmeros"/>
-        <w:tabs>
-          <w:tab w:val="num" w:pos="360"/>
-        </w:tabs>
-        <w:ind w:left="360" w:hanging="360"/>
-        <w:rPr>
-          <w:rFonts w:ascii="Arial Narrow" w:hAnsi="Arial Narrow"/>
-          <w:lang w:val="es-CL"/>
-        </w:rPr>
-      </w:pPr>
-      <w:r>
-        <w:rPr>
-          <w:rFonts w:ascii="Arial Narrow" w:hAnsi="Arial Narrow"/>
-          <w:lang w:val="es-CL"/>
-        </w:rPr>
-        <w:t>Link del repositorio GitHub.</w:t>
-      </w:r>
-    </w:p>
-    <w:p>
-      <w:pPr>
-        <w:pStyle w:val="Listaconnmeros"/>
-        <w:tabs>
-          <w:tab w:val="num" w:pos="360"/>
-        </w:tabs>
-        <w:ind w:left="360" w:hanging="360"/>
-        <w:rPr>
-          <w:rFonts w:ascii="Arial Narrow" w:hAnsi="Arial Narrow"/>
-          <w:lang w:val="es-CL"/>
-        </w:rPr>
-      </w:pPr>
-      <w:r>
-        <w:rPr>
-          <w:rFonts w:ascii="Arial Narrow" w:hAnsi="Arial Narrow"/>
-          <w:lang w:val="es-CL"/>
-        </w:rPr>
-        <w:t>Aplicación funcionando en navegador (sin dependencias complejas).</w:t>
-      </w:r>
-    </w:p>
-    <w:p>
-      <w:pPr>
-        <w:pStyle w:val="Listaconnmeros"/>
-        <w:tabs>
-          <w:tab w:val="num" w:pos="360"/>
-        </w:tabs>
-        <w:ind w:left="360" w:hanging="360"/>
-        <w:rPr>
-          <w:rFonts w:ascii="Arial Narrow" w:hAnsi="Arial Narrow"/>
-          <w:lang w:val="es-CL"/>
-        </w:rPr>
-      </w:pPr>
-      <w:r>
-        <w:rPr>
-          <w:rFonts w:ascii="Arial Narrow" w:hAnsi="Arial Narrow"/>
-          <w:lang w:val="es-CL"/>
-        </w:rPr>
-        <w:t>README con evidencias (capturas) y verificación de requisitos.</w:t>
-      </w:r>
-    </w:p>
-    <w:p>
-      <w:pPr>
-        <w:rPr>
-          <w:rFonts w:ascii="Arial Narrow" w:hAnsi="Arial Narrow"/>
-          <w:sz w:val="22"/>
-          <w:szCs w:val="22"/>
-        </w:rPr>
-      </w:pPr>
-      <w:r>
-        <w:rPr>
-          <w:rFonts w:ascii="Arial Narrow" w:hAnsi="Arial Narrow"/>
-          <w:b/>
-          <w:sz w:val="22"/>
-          <w:szCs w:val="22"/>
-        </w:rPr>
-        <w:t>V. PREGUNTAS DE CIERRE (para reflexión breve)</w:t>
-      </w:r>
-    </w:p>
-    <w:p>
-      <w:pPr>
-        <w:pStyle w:val="Listaconnmeros"/>
-        <w:numPr>
-          <w:ilvl w:val="0"/>
-          <w:numId w:val="4"/>
-        </w:numPr>
-        <w:rPr>
-          <w:rFonts w:ascii="Arial Narrow" w:hAnsi="Arial Narrow"/>
-          <w:lang w:val="es-CL"/>
-        </w:rPr>
-      </w:pPr>
-      <w:r>
-        <w:rPr>
-          <w:rFonts w:ascii="Arial Narrow" w:hAnsi="Arial Narrow"/>
-          <w:lang w:val="es-CL"/>
-        </w:rPr>
-        <w:t>¿Qué validación fue la más compleja y cómo la resolviste?</w:t>
-      </w:r>
-    </w:p>
-    <w:p>
-      <w:pPr>
-        <w:pStyle w:val="Listaconnmeros"/>
-        <w:numPr>
-          <w:ilvl w:val="0"/>
-          <w:numId w:val="4"/>
-        </w:numPr>
-        <w:rPr>
-          <w:rFonts w:ascii="Arial Narrow" w:hAnsi="Arial Narrow"/>
-          <w:lang w:val="es-CL"/>
-        </w:rPr>
-      </w:pPr>
-      <w:r>
-        <w:rPr>
-          <w:rFonts w:ascii="Arial Narrow" w:hAnsi="Arial Narrow"/>
-          <w:lang w:val="es-CL"/>
-        </w:rPr>
-        <w:t>¿Qué parte del DOM te permitió mejorar más la experiencia de usuario?</w:t>
-      </w:r>
-    </w:p>
-    <w:p>
-      <w:pPr>
-        <w:pStyle w:val="Listaconnmeros"/>
-        <w:numPr>
-          <w:ilvl w:val="0"/>
-          <w:numId w:val="4"/>
-        </w:numPr>
-        <w:rPr>
-          <w:rFonts w:ascii="Arial Narrow" w:hAnsi="Arial Narrow"/>
-          <w:lang w:val="es-CL"/>
-        </w:rPr>
-      </w:pPr>
-      <w:r>
-        <w:rPr>
-          <w:rFonts w:ascii="Arial Narrow" w:hAnsi="Arial Narrow"/>
-          <w:lang w:val="es-CL"/>
-        </w:rPr>
-        <w:t>Si tuvieras 2 horas más, ¿qué mejora implementarías y por qué?</w:t>
-      </w:r>
-    </w:p>
-    <w:p>
-      <w:pPr>
-        <w:pStyle w:val="Listaconvietas"/>
-        <w:numPr>
-          <w:ilvl w:val="0"/>
-          <w:numId w:val="0"/>
-        </w:numPr>
-        <w:ind w:left="360" w:hanging="360"/>
-        <w:rPr>
-          <w:rFonts w:ascii="Arial Narrow" w:hAnsi="Arial Narrow"/>
-          <w:bCs/>
-          <w:lang w:val="es-CL"/>
-        </w:rPr>
-      </w:pPr>
-    </w:p>
-    <w:p>
-      <w:pPr>
         <w:spacing w:after="120"/>
         <w:jc w:val="both"/>
         <w:rPr>
@@ -1410,8 +1734,8 @@
       </w:pPr>
     </w:p>
     <w:sectPr>
-      <w:headerReference w:type="default" r:id="rId13"/>
-      <w:footerReference w:type="default" r:id="rId14"/>
+      <w:headerReference w:type="default" r:id="rId24"/>
+      <w:footerReference w:type="default" r:id="rId25"/>
       <w:pgSz w:w="12240" w:h="15840"/>
       <w:pgMar w:top="1417" w:right="1701" w:bottom="1417" w:left="1701" w:header="708" w:footer="708" w:gutter="0"/>
       <w:cols w:space="708"/>
@@ -1871,6 +2195,119 @@
     </w:lvl>
   </w:abstractNum>
   <w:abstractNum w:abstractNumId="2" w15:restartNumberingAfterBreak="0">
+    <w:nsid w:val="53E23CB9"/>
+    <w:multiLevelType w:val="hybridMultilevel"/>
+    <w:tmpl w:val="707259DC"/>
+    <w:lvl w:ilvl="0" w:tplc="0C0A0001">
+      <w:start w:val="1"/>
+      <w:numFmt w:val="bullet"/>
+      <w:lvlText w:val=""/>
+      <w:lvlJc w:val="left"/>
+      <w:pPr>
+        <w:ind w:left="720" w:hanging="360"/>
+      </w:pPr>
+      <w:rPr>
+        <w:rFonts w:ascii="Symbol" w:hAnsi="Symbol" w:hint="default"/>
+      </w:rPr>
+    </w:lvl>
+    <w:lvl w:ilvl="1" w:tplc="0C0A0003" w:tentative="1">
+      <w:start w:val="1"/>
+      <w:numFmt w:val="bullet"/>
+      <w:lvlText w:val="o"/>
+      <w:lvlJc w:val="left"/>
+      <w:pPr>
+        <w:ind w:left="1440" w:hanging="360"/>
+      </w:pPr>
+      <w:rPr>
+        <w:rFonts w:ascii="Courier New" w:hAnsi="Courier New" w:cs="Courier New" w:hint="default"/>
+      </w:rPr>
+    </w:lvl>
+    <w:lvl w:ilvl="2" w:tplc="0C0A0005" w:tentative="1">
+      <w:start w:val="1"/>
+      <w:numFmt w:val="bullet"/>
+      <w:lvlText w:val=""/>
+      <w:lvlJc w:val="left"/>
+      <w:pPr>
+        <w:ind w:left="2160" w:hanging="360"/>
+      </w:pPr>
+      <w:rPr>
+        <w:rFonts w:ascii="Wingdings" w:hAnsi="Wingdings" w:hint="default"/>
+      </w:rPr>
+    </w:lvl>
+    <w:lvl w:ilvl="3" w:tplc="0C0A0001" w:tentative="1">
+      <w:start w:val="1"/>
+      <w:numFmt w:val="bullet"/>
+      <w:lvlText w:val=""/>
+      <w:lvlJc w:val="left"/>
+      <w:pPr>
+        <w:ind w:left="2880" w:hanging="360"/>
+      </w:pPr>
+      <w:rPr>
+        <w:rFonts w:ascii="Symbol" w:hAnsi="Symbol" w:hint="default"/>
+      </w:rPr>
+    </w:lvl>
+    <w:lvl w:ilvl="4" w:tplc="0C0A0003" w:tentative="1">
+      <w:start w:val="1"/>
+      <w:numFmt w:val="bullet"/>
+      <w:lvlText w:val="o"/>
+      <w:lvlJc w:val="left"/>
+      <w:pPr>
+        <w:ind w:left="3600" w:hanging="360"/>
+      </w:pPr>
+      <w:rPr>
+        <w:rFonts w:ascii="Courier New" w:hAnsi="Courier New" w:cs="Courier New" w:hint="default"/>
+      </w:rPr>
+    </w:lvl>
+    <w:lvl w:ilvl="5" w:tplc="0C0A0005" w:tentative="1">
+      <w:start w:val="1"/>
+      <w:numFmt w:val="bullet"/>
+      <w:lvlText w:val=""/>
+      <w:lvlJc w:val="left"/>
+      <w:pPr>
+        <w:ind w:left="4320" w:hanging="360"/>
+      </w:pPr>
+      <w:rPr>
+        <w:rFonts w:ascii="Wingdings" w:hAnsi="Wingdings" w:hint="default"/>
+      </w:rPr>
+    </w:lvl>
+    <w:lvl w:ilvl="6" w:tplc="0C0A0001" w:tentative="1">
+      <w:start w:val="1"/>
+      <w:numFmt w:val="bullet"/>
+      <w:lvlText w:val=""/>
+      <w:lvlJc w:val="left"/>
+      <w:pPr>
+        <w:ind w:left="5040" w:hanging="360"/>
+      </w:pPr>
+      <w:rPr>
+        <w:rFonts w:ascii="Symbol" w:hAnsi="Symbol" w:hint="default"/>
+      </w:rPr>
+    </w:lvl>
+    <w:lvl w:ilvl="7" w:tplc="0C0A0003" w:tentative="1">
+      <w:start w:val="1"/>
+      <w:numFmt w:val="bullet"/>
+      <w:lvlText w:val="o"/>
+      <w:lvlJc w:val="left"/>
+      <w:pPr>
+        <w:ind w:left="5760" w:hanging="360"/>
+      </w:pPr>
+      <w:rPr>
+        <w:rFonts w:ascii="Courier New" w:hAnsi="Courier New" w:cs="Courier New" w:hint="default"/>
+      </w:rPr>
+    </w:lvl>
+    <w:lvl w:ilvl="8" w:tplc="0C0A0005" w:tentative="1">
+      <w:start w:val="1"/>
+      <w:numFmt w:val="bullet"/>
+      <w:lvlText w:val=""/>
+      <w:lvlJc w:val="left"/>
+      <w:pPr>
+        <w:ind w:left="6480" w:hanging="360"/>
+      </w:pPr>
+      <w:rPr>
+        <w:rFonts w:ascii="Wingdings" w:hAnsi="Wingdings" w:hint="default"/>
+      </w:rPr>
+    </w:lvl>
+  </w:abstractNum>
+  <w:abstractNum w:abstractNumId="3" w15:restartNumberingAfterBreak="0">
     <w:nsid w:val="5B1D2E3C"/>
     <w:multiLevelType w:val="hybridMultilevel"/>
     <w:tmpl w:val="CE507274"/>
@@ -1956,7 +2393,7 @@
       </w:pPr>
     </w:lvl>
   </w:abstractNum>
-  <w:abstractNum w:abstractNumId="3" w15:restartNumberingAfterBreak="0">
+  <w:abstractNum w:abstractNumId="4" w15:restartNumberingAfterBreak="0">
     <w:nsid w:val="7BC7432B"/>
     <w:multiLevelType w:val="hybridMultilevel"/>
     <w:tmpl w:val="8506E020"/>
@@ -2047,7 +2484,7 @@
     </w:lvl>
   </w:abstractNum>
   <w:num w:numId="1" w16cid:durableId="1676490875">
-    <w:abstractNumId w:val="3"/>
+    <w:abstractNumId w:val="4"/>
   </w:num>
   <w:num w:numId="2" w16cid:durableId="1734114842">
     <w:abstractNumId w:val="1"/>
@@ -2056,6 +2493,9 @@
     <w:abstractNumId w:val="0"/>
   </w:num>
   <w:num w:numId="4" w16cid:durableId="1394083308">
+    <w:abstractNumId w:val="3"/>
+  </w:num>
+  <w:num w:numId="5" w16cid:durableId="2022507875">
     <w:abstractNumId w:val="2"/>
   </w:num>
   <w:numIdMacAtCleanup w:val="4"/>
@@ -3501,7 +3941,15 @@
 </file>
 
 <file path=customXml/item1.xml><?xml version="1.0" encoding="utf-8"?>
-<b:Sources xmlns:b="http://schemas.openxmlformats.org/officeDocument/2006/bibliography" xmlns="http://schemas.openxmlformats.org/officeDocument/2006/bibliography" SelectedStyle="\APASixthEditionOfficeOnline.xsl" StyleName="APA" Version="6"/>
+<p:properties xmlns:p="http://schemas.microsoft.com/office/2006/metadata/properties" xmlns:xsi="http://www.w3.org/2001/XMLSchema-instance" xmlns:pc="http://schemas.microsoft.com/office/infopath/2007/PartnerControls">
+  <documentManagement>
+    <TaxCatchAll xmlns="3379947c-9ae5-48ae-a0f3-9d9fc57fa7ad" xsi:nil="true"/>
+    <lcf76f155ced4ddcb4097134ff3c332f xmlns="412d3e04-2c44-4d08-89c6-88a010fdd284">
+      <Terms xmlns="http://schemas.microsoft.com/office/infopath/2007/PartnerControls"/>
+    </lcf76f155ced4ddcb4097134ff3c332f>
+    <TipoDocKD xmlns="412d3e04-2c44-4d08-89c6-88a010fdd284" xsi:nil="true"/>
+  </documentManagement>
+</p:properties>
 </file>
 
 <file path=customXml/item2.xml><?xml version="1.0" encoding="utf-8"?>
@@ -3514,15 +3962,7 @@
 </file>
 
 <file path=customXml/item3.xml><?xml version="1.0" encoding="utf-8"?>
-<p:properties xmlns:p="http://schemas.microsoft.com/office/2006/metadata/properties" xmlns:xsi="http://www.w3.org/2001/XMLSchema-instance" xmlns:pc="http://schemas.microsoft.com/office/infopath/2007/PartnerControls">
-  <documentManagement>
-    <TaxCatchAll xmlns="3379947c-9ae5-48ae-a0f3-9d9fc57fa7ad" xsi:nil="true"/>
-    <lcf76f155ced4ddcb4097134ff3c332f xmlns="412d3e04-2c44-4d08-89c6-88a010fdd284">
-      <Terms xmlns="http://schemas.microsoft.com/office/infopath/2007/PartnerControls"/>
-    </lcf76f155ced4ddcb4097134ff3c332f>
-    <TipoDocKD xmlns="412d3e04-2c44-4d08-89c6-88a010fdd284" xsi:nil="true"/>
-  </documentManagement>
-</p:properties>
+<b:Sources xmlns:b="http://schemas.openxmlformats.org/officeDocument/2006/bibliography" xmlns="http://schemas.openxmlformats.org/officeDocument/2006/bibliography" SelectedStyle="\APASixthEditionOfficeOnline.xsl" StyleName="APA" Version="6"/>
 </file>
 
 <file path=customXml/item4.xml><?xml version="1.0" encoding="utf-8"?>
@@ -3796,9 +4236,12 @@
 </file>
 
 <file path=customXml/itemProps1.xml><?xml version="1.0" encoding="utf-8"?>
-<ds:datastoreItem xmlns:ds="http://schemas.openxmlformats.org/officeDocument/2006/customXml" ds:itemID="{FEBC4B49-24C3-497C-AB91-173F384051FF}">
+<ds:datastoreItem xmlns:ds="http://schemas.openxmlformats.org/officeDocument/2006/customXml" ds:itemID="{A6D01FF2-578E-4482-AFC1-FC0D791D9FCD}">
   <ds:schemaRefs>
-    <ds:schemaRef ds:uri="http://schemas.openxmlformats.org/officeDocument/2006/bibliography"/>
+    <ds:schemaRef ds:uri="http://schemas.microsoft.com/office/2006/metadata/properties"/>
+    <ds:schemaRef ds:uri="http://schemas.microsoft.com/office/infopath/2007/PartnerControls"/>
+    <ds:schemaRef ds:uri="3379947c-9ae5-48ae-a0f3-9d9fc57fa7ad"/>
+    <ds:schemaRef ds:uri="412d3e04-2c44-4d08-89c6-88a010fdd284"/>
   </ds:schemaRefs>
 </ds:datastoreItem>
 </file>
@@ -3812,12 +4255,9 @@
 </file>
 
 <file path=customXml/itemProps3.xml><?xml version="1.0" encoding="utf-8"?>
-<ds:datastoreItem xmlns:ds="http://schemas.openxmlformats.org/officeDocument/2006/customXml" ds:itemID="{A6D01FF2-578E-4482-AFC1-FC0D791D9FCD}">
+<ds:datastoreItem xmlns:ds="http://schemas.openxmlformats.org/officeDocument/2006/customXml" ds:itemID="{FEBC4B49-24C3-497C-AB91-173F384051FF}">
   <ds:schemaRefs>
-    <ds:schemaRef ds:uri="http://schemas.microsoft.com/office/2006/metadata/properties"/>
-    <ds:schemaRef ds:uri="http://schemas.microsoft.com/office/infopath/2007/PartnerControls"/>
-    <ds:schemaRef ds:uri="3379947c-9ae5-48ae-a0f3-9d9fc57fa7ad"/>
-    <ds:schemaRef ds:uri="412d3e04-2c44-4d08-89c6-88a010fdd284"/>
+    <ds:schemaRef ds:uri="http://schemas.openxmlformats.org/officeDocument/2006/bibliography"/>
   </ds:schemaRefs>
 </ds:datastoreItem>
 </file>

</xml_diff>